<commit_message>
Rebuild manual with improved screenshot composition
- Main screenshot changed to BOTH mode (showing blue Salesio markers)
- JP mode screenshot zoomed into Japan (navy markers clearly visible)
- Added ID mode screenshot (all-blue markers)
- Comfort/serial tabs use BOTH mode background
- All figures renumbered

Co-Authored-By: Claude Opus 4.6 (1M context) <noreply@anthropic.com>
</commit_message>
<xml_diff>
--- a/SchooMy_マニュアル_v4.docx
+++ b/SchooMy_マニュアル_v4.docx
@@ -261,7 +261,7 @@
           <wp:inline distT="0" distB="0" distL="0" distR="0">
             <wp:extent cx="5524500" cy="3552825"/>
             <wp:effectExtent t="0" r="0" b="0" l="0"/>
-            <wp:docPr id="1" name="01_full_jp.png" descr="01_full_jp.png" title="01_full_jp.png"/>
+            <wp:docPr id="1" name="01_full_both.png" descr="01_full_both.png" title="01_full_both.png"/>
             <wp:cNvGraphicFramePr>
               <a:graphicFrameLocks xmlns:a="http://schemas.openxmlformats.org/drawingml/2006/main" noChangeAspect="1"/>
             </wp:cNvGraphicFramePr>
@@ -311,7 +311,7 @@
           <w:sz w:val="18"/>
           <w:szCs w:val="18"/>
         </w:rPr>
-        <w:t xml:space="preserve">図1: アプリ全体画面（日本目線モード）</w:t>
+        <w:t xml:space="preserve">図1: アプリ全体画面（両方モード）</w:t>
       </w:r>
     </w:p>
     <w:p>
@@ -345,7 +345,7 @@
         <w:shd w:fill="E8EDF5" w:val="clear"/>
         <w:spacing w:after="200" w:before="100"/>
       </w:pPr>
-      <w:hyperlink w:history="1" r:id="rId8iuthxr3it65pms3dbu0_">
+      <w:hyperlink w:history="1" r:id="rId4w6kybszplske41q4rog9">
         <w:r>
           <w:rPr>
             <w:rStyle w:val="Hyperlink"/>
@@ -732,7 +732,7 @@
           <wp:inline distT="0" distB="0" distL="0" distR="0">
             <wp:extent cx="4762500" cy="361950"/>
             <wp:effectExtent t="0" r="0" b="0" l="0"/>
-            <wp:docPr id="1" name="07_header_area.png" descr="07_header_area.png" title="07_header_area.png"/>
+            <wp:docPr id="1" name="08_header_area.png" descr="08_header_area.png" title="08_header_area.png"/>
             <wp:cNvGraphicFramePr>
               <a:graphicFrameLocks xmlns:a="http://schemas.openxmlformats.org/drawingml/2006/main" noChangeAspect="1"/>
             </wp:cNvGraphicFramePr>
@@ -837,7 +837,7 @@
           <wp:inline distT="0" distB="0" distL="0" distR="0">
             <wp:extent cx="2286000" cy="3686175"/>
             <wp:effectExtent t="0" r="0" b="0" l="0"/>
-            <wp:docPr id="1" name="10_school_cards.png" descr="10_school_cards.png" title="10_school_cards.png"/>
+            <wp:docPr id="1" name="11_school_cards.png" descr="11_school_cards.png" title="11_school_cards.png"/>
             <wp:cNvGraphicFramePr>
               <a:graphicFrameLocks xmlns:a="http://schemas.openxmlformats.org/drawingml/2006/main" noChangeAspect="1"/>
             </wp:cNvGraphicFramePr>
@@ -942,7 +942,7 @@
           <wp:inline distT="0" distB="0" distL="0" distR="0">
             <wp:extent cx="5334000" cy="314325"/>
             <wp:effectExtent t="0" r="0" b="0" l="0"/>
-            <wp:docPr id="1" name="09_compare_bar.png" descr="09_compare_bar.png" title="09_compare_bar.png"/>
+            <wp:docPr id="1" name="10_compare_bar.png" descr="10_compare_bar.png" title="10_compare_bar.png"/>
             <wp:cNvGraphicFramePr>
               <a:graphicFrameLocks xmlns:a="http://schemas.openxmlformats.org/drawingml/2006/main" noChangeAspect="1"/>
             </wp:cNvGraphicFramePr>
@@ -1312,7 +1312,7 @@
           <wp:inline distT="0" distB="0" distL="0" distR="0">
             <wp:extent cx="5524500" cy="3552825"/>
             <wp:effectExtent t="0" r="0" b="0" l="0"/>
-            <wp:docPr id="1" name="03_both_mode.png" descr="03_both_mode.png" title="03_both_mode.png"/>
+            <wp:docPr id="1" name="04_both_mode.png" descr="04_both_mode.png" title="04_both_mode.png"/>
             <wp:cNvGraphicFramePr>
               <a:graphicFrameLocks xmlns:a="http://schemas.openxmlformats.org/drawingml/2006/main" noChangeAspect="1"/>
             </wp:cNvGraphicFramePr>
@@ -1375,7 +1375,7 @@
           <wp:inline distT="0" distB="0" distL="0" distR="0">
             <wp:extent cx="5524500" cy="3552825"/>
             <wp:effectExtent t="0" r="0" b="0" l="0"/>
-            <wp:docPr id="1" name="04_id_mode.png" descr="04_id_mode.png" title="04_id_mode.png"/>
+            <wp:docPr id="1" name="02_jp_japan_zoom.png" descr="02_jp_japan_zoom.png" title="02_jp_japan_zoom.png"/>
             <wp:cNvGraphicFramePr>
               <a:graphicFrameLocks xmlns:a="http://schemas.openxmlformats.org/drawingml/2006/main" noChangeAspect="1"/>
             </wp:cNvGraphicFramePr>
@@ -1425,141 +1425,7 @@
           <w:sz w:val="18"/>
           <w:szCs w:val="18"/>
         </w:rPr>
-        <w:t xml:space="preserve">図6: インドネシア目線モード</w:t>
-      </w:r>
-    </w:p>
-    <w:p>
-      <w:pPr>
-        <w:pBdr>
-          <w:left w:val="single" w:color="2F6EB5" w:sz="12" w:space="8"/>
-        </w:pBdr>
-        <w:spacing w:after="200" w:before="100"/>
-        <w:ind w:left="200"/>
-      </w:pPr>
-      <w:r>
-        <w:rPr>
-          <w:rFonts w:ascii="Arial" w:cs="Arial" w:eastAsia="Arial" w:hAnsi="Arial"/>
-          <w:b/>
-          <w:bCs/>
-          <w:color w:val="2F6EB5"/>
-          <w:sz w:val="20"/>
-          <w:szCs w:val="20"/>
-        </w:rPr>
-        <w:t xml:space="preserve">HINT: </w:t>
-      </w:r>
-      <w:r>
-        <w:rPr>
-          <w:rFonts w:ascii="Arial" w:cs="Arial" w:eastAsia="Arial" w:hAnsi="Arial"/>
-          <w:color w:val="444444"/>
-          <w:sz w:val="20"/>
-          <w:szCs w:val="20"/>
-        </w:rPr>
-        <w:t xml:space="preserve">「日本では快適だけどインドネシアでは不快」「同じ教室でも評価が変わる」という気づきを通じて、文化的背景による快適性の違いを学べます。</w:t>
-      </w:r>
-    </w:p>
-    <w:p>
-      <w:r>
-        <w:br w:type="page"/>
-      </w:r>
-    </w:p>
-    <w:p>
-      <w:pPr>
-        <w:pStyle w:val="Heading1"/>
-      </w:pPr>
-      <w:r>
-        <w:t xml:space="preserve">5. マップの操作</w:t>
-      </w:r>
-    </w:p>
-    <w:p>
-      <w:pPr>
-        <w:pStyle w:val="Heading2"/>
-      </w:pPr>
-      <w:r>
-        <w:t xml:space="preserve">基本操作</w:t>
-      </w:r>
-    </w:p>
-    <w:p>
-      <w:pPr>
-        <w:pStyle w:val="ListParagraph"/>
-        <w:numPr>
-          <w:ilvl w:val="0"/>
-          <w:numId w:val="3"/>
-        </w:numPr>
-        <w:spacing w:after="60"/>
-      </w:pPr>
-      <w:r>
-        <w:rPr>
-          <w:rFonts w:ascii="Arial" w:cs="Arial" w:eastAsia="Arial" w:hAnsi="Arial"/>
-          <w:b/>
-          <w:bCs/>
-          <w:sz w:val="22"/>
-          <w:szCs w:val="22"/>
-        </w:rPr>
-        <w:t xml:space="preserve">ズーム: </w:t>
-      </w:r>
-      <w:r>
-        <w:rPr>
-          <w:rFonts w:ascii="Arial" w:cs="Arial" w:eastAsia="Arial" w:hAnsi="Arial"/>
-          <w:sz w:val="22"/>
-          <w:szCs w:val="22"/>
-        </w:rPr>
-        <w:t xml:space="preserve">マウスホイール または 画面左上の +/- ボタン</w:t>
-      </w:r>
-    </w:p>
-    <w:p>
-      <w:pPr>
-        <w:pStyle w:val="ListParagraph"/>
-        <w:numPr>
-          <w:ilvl w:val="0"/>
-          <w:numId w:val="3"/>
-        </w:numPr>
-        <w:spacing w:after="60"/>
-      </w:pPr>
-      <w:r>
-        <w:rPr>
-          <w:rFonts w:ascii="Arial" w:cs="Arial" w:eastAsia="Arial" w:hAnsi="Arial"/>
-          <w:b/>
-          <w:bCs/>
-          <w:sz w:val="22"/>
-          <w:szCs w:val="22"/>
-        </w:rPr>
-        <w:t xml:space="preserve">移動: </w:t>
-      </w:r>
-      <w:r>
-        <w:rPr>
-          <w:rFonts w:ascii="Arial" w:cs="Arial" w:eastAsia="Arial" w:hAnsi="Arial"/>
-          <w:sz w:val="22"/>
-          <w:szCs w:val="22"/>
-        </w:rPr>
-        <w:t xml:space="preserve">マウスでドラッグ</w:t>
-      </w:r>
-    </w:p>
-    <w:p>
-      <w:pPr>
-        <w:pStyle w:val="ListParagraph"/>
-        <w:numPr>
-          <w:ilvl w:val="0"/>
-          <w:numId w:val="3"/>
-        </w:numPr>
-        <w:spacing w:after="120"/>
-      </w:pPr>
-      <w:r>
-        <w:rPr>
-          <w:rFonts w:ascii="Arial" w:cs="Arial" w:eastAsia="Arial" w:hAnsi="Arial"/>
-          <w:b/>
-          <w:bCs/>
-          <w:sz w:val="22"/>
-          <w:szCs w:val="22"/>
-        </w:rPr>
-        <w:t xml:space="preserve">学校の詳細: </w:t>
-      </w:r>
-      <w:r>
-        <w:rPr>
-          <w:rFonts w:ascii="Arial" w:cs="Arial" w:eastAsia="Arial" w:hAnsi="Arial"/>
-          <w:sz w:val="22"/>
-          <w:szCs w:val="22"/>
-        </w:rPr>
-        <w:t xml:space="preserve">マーカーをクリックするとポップアップが開きます</w:t>
+        <w:t xml:space="preserve">図6: 日本目線モード（日本拡大 — ネイビーのマーカーが高スコアを示す）</w:t>
       </w:r>
     </w:p>
     <w:p>
@@ -1572,7 +1438,7 @@
           <wp:inline distT="0" distB="0" distL="0" distR="0">
             <wp:extent cx="5524500" cy="3552825"/>
             <wp:effectExtent t="0" r="0" b="0" l="0"/>
-            <wp:docPr id="1" name="02_popup.png" descr="02_popup.png" title="02_popup.png"/>
+            <wp:docPr id="1" name="05_id_mode.png" descr="05_id_mode.png" title="05_id_mode.png"/>
             <wp:cNvGraphicFramePr>
               <a:graphicFrameLocks xmlns:a="http://schemas.openxmlformats.org/drawingml/2006/main" noChangeAspect="1"/>
             </wp:cNvGraphicFramePr>
@@ -1622,7 +1488,49 @@
           <w:sz w:val="18"/>
           <w:szCs w:val="18"/>
         </w:rPr>
-        <w:t xml:space="preserve">図7: 学校ポップアップ（センサー詳細情報）</w:t>
+        <w:t xml:space="preserve">図7: インドネシア目線モード</w:t>
+      </w:r>
+    </w:p>
+    <w:p>
+      <w:pPr>
+        <w:pBdr>
+          <w:left w:val="single" w:color="2F6EB5" w:sz="12" w:space="8"/>
+        </w:pBdr>
+        <w:spacing w:after="200" w:before="100"/>
+        <w:ind w:left="200"/>
+      </w:pPr>
+      <w:r>
+        <w:rPr>
+          <w:rFonts w:ascii="Arial" w:cs="Arial" w:eastAsia="Arial" w:hAnsi="Arial"/>
+          <w:b/>
+          <w:bCs/>
+          <w:color w:val="2F6EB5"/>
+          <w:sz w:val="20"/>
+          <w:szCs w:val="20"/>
+        </w:rPr>
+        <w:t xml:space="preserve">HINT: </w:t>
+      </w:r>
+      <w:r>
+        <w:rPr>
+          <w:rFonts w:ascii="Arial" w:cs="Arial" w:eastAsia="Arial" w:hAnsi="Arial"/>
+          <w:color w:val="444444"/>
+          <w:sz w:val="20"/>
+          <w:szCs w:val="20"/>
+        </w:rPr>
+        <w:t xml:space="preserve">「日本では快適だけどインドネシアでは不快」「同じ教室でも評価が変わる」という気づきを通じて、文化的背景による快適性の違いを学べます。</w:t>
+      </w:r>
+    </w:p>
+    <w:p>
+      <w:r>
+        <w:br w:type="page"/>
+      </w:r>
+    </w:p>
+    <w:p>
+      <w:pPr>
+        <w:pStyle w:val="Heading1"/>
+      </w:pPr>
+      <w:r>
+        <w:t xml:space="preserve">5. マップの操作</w:t>
       </w:r>
     </w:p>
     <w:p>
@@ -1630,683 +1538,93 @@
         <w:pStyle w:val="Heading2"/>
       </w:pPr>
       <w:r>
-        <w:t xml:space="preserve">マーカーの色とスコア</w:t>
-      </w:r>
-    </w:p>
-    <w:p>
-      <w:pPr>
-        <w:spacing w:after="120"/>
-      </w:pPr>
-      <w:r>
-        <w:rPr>
-          <w:rFonts w:ascii="Arial" w:cs="Arial" w:eastAsia="Arial" w:hAnsi="Arial"/>
+        <w:t xml:space="preserve">基本操作</w:t>
+      </w:r>
+    </w:p>
+    <w:p>
+      <w:pPr>
+        <w:pStyle w:val="ListParagraph"/>
+        <w:numPr>
+          <w:ilvl w:val="0"/>
+          <w:numId w:val="3"/>
+        </w:numPr>
+        <w:spacing w:after="60"/>
+      </w:pPr>
+      <w:r>
+        <w:rPr>
+          <w:rFonts w:ascii="Arial" w:cs="Arial" w:eastAsia="Arial" w:hAnsi="Arial"/>
+          <w:b/>
+          <w:bCs/>
           <w:sz w:val="22"/>
           <w:szCs w:val="22"/>
         </w:rPr>
-        <w:t xml:space="preserve">マーカーの色は快適スコアに連動しています。</w:t>
-      </w:r>
-    </w:p>
-    <w:tbl>
-      <w:tblPr>
-        <w:tblW w:type="dxa" w:w="9026"/>
-        <w:tblBorders>
-          <w:top w:val="single" w:color="auto" w:sz="4"/>
-          <w:left w:val="single" w:color="auto" w:sz="4"/>
-          <w:bottom w:val="single" w:color="auto" w:sz="4"/>
-          <w:right w:val="single" w:color="auto" w:sz="4"/>
-          <w:insideH w:val="single" w:color="auto" w:sz="4"/>
-          <w:insideV w:val="single" w:color="auto" w:sz="4"/>
-        </w:tblBorders>
-      </w:tblPr>
-      <w:tblGrid>
-        <w:gridCol w:w="1800"/>
-        <w:gridCol w:w="2400"/>
-        <w:gridCol w:w="2400"/>
-        <w:gridCol w:w="2426"/>
-      </w:tblGrid>
-      <w:tr>
-        <w:tc>
-          <w:tcPr>
-            <w:tcW w:type="dxa" w:w="1800"/>
-            <w:tcBorders>
-              <w:top w:val="single" w:color="CCCCCC" w:sz="1"/>
-              <w:left w:val="single" w:color="CCCCCC" w:sz="1"/>
-              <w:bottom w:val="single" w:color="CCCCCC" w:sz="1"/>
-              <w:right w:val="single" w:color="CCCCCC" w:sz="1"/>
-            </w:tcBorders>
-            <w:shd w:fill="1E3060" w:val="clear"/>
-            <w:tcMar>
-              <w:top w:type="dxa" w:w="80"/>
-              <w:left w:type="dxa" w:w="120"/>
-              <w:bottom w:type="dxa" w:w="80"/>
-              <w:right w:type="dxa" w:w="120"/>
-            </w:tcMar>
-            <w:vAlign w:val="center"/>
-          </w:tcPr>
-          <w:p>
-            <w:pPr>
-              <w:jc w:val="center"/>
-            </w:pPr>
-            <w:r>
-              <w:rPr>
-                <w:rFonts w:ascii="Arial" w:cs="Arial" w:eastAsia="Arial" w:hAnsi="Arial"/>
-                <w:b/>
-                <w:bCs/>
-                <w:color w:val="FFFFFF"/>
-                <w:sz w:val="20"/>
-                <w:szCs w:val="20"/>
-              </w:rPr>
-              <w:t xml:space="preserve">スコア</w:t>
-            </w:r>
-          </w:p>
-        </w:tc>
-        <w:tc>
-          <w:tcPr>
-            <w:tcW w:type="dxa" w:w="2400"/>
-            <w:tcBorders>
-              <w:top w:val="single" w:color="CCCCCC" w:sz="1"/>
-              <w:left w:val="single" w:color="CCCCCC" w:sz="1"/>
-              <w:bottom w:val="single" w:color="CCCCCC" w:sz="1"/>
-              <w:right w:val="single" w:color="CCCCCC" w:sz="1"/>
-            </w:tcBorders>
-            <w:shd w:fill="1E3060" w:val="clear"/>
-            <w:tcMar>
-              <w:top w:type="dxa" w:w="80"/>
-              <w:left w:type="dxa" w:w="120"/>
-              <w:bottom w:type="dxa" w:w="80"/>
-              <w:right w:type="dxa" w:w="120"/>
-            </w:tcMar>
-            <w:vAlign w:val="center"/>
-          </w:tcPr>
-          <w:p>
-            <w:pPr>
-              <w:jc w:val="center"/>
-            </w:pPr>
-            <w:r>
-              <w:rPr>
-                <w:rFonts w:ascii="Arial" w:cs="Arial" w:eastAsia="Arial" w:hAnsi="Arial"/>
-                <w:b/>
-                <w:bCs/>
-                <w:color w:val="FFFFFF"/>
-                <w:sz w:val="20"/>
-                <w:szCs w:val="20"/>
-              </w:rPr>
-              <w:t xml:space="preserve">色</w:t>
-            </w:r>
-          </w:p>
-        </w:tc>
-        <w:tc>
-          <w:tcPr>
-            <w:tcW w:type="dxa" w:w="2400"/>
-            <w:tcBorders>
-              <w:top w:val="single" w:color="CCCCCC" w:sz="1"/>
-              <w:left w:val="single" w:color="CCCCCC" w:sz="1"/>
-              <w:bottom w:val="single" w:color="CCCCCC" w:sz="1"/>
-              <w:right w:val="single" w:color="CCCCCC" w:sz="1"/>
-            </w:tcBorders>
-            <w:shd w:fill="1E3060" w:val="clear"/>
-            <w:tcMar>
-              <w:top w:type="dxa" w:w="80"/>
-              <w:left w:type="dxa" w:w="120"/>
-              <w:bottom w:type="dxa" w:w="80"/>
-              <w:right w:type="dxa" w:w="120"/>
-            </w:tcMar>
-            <w:vAlign w:val="center"/>
-          </w:tcPr>
-          <w:p>
-            <w:pPr>
-              <w:jc w:val="center"/>
-            </w:pPr>
-            <w:r>
-              <w:rPr>
-                <w:rFonts w:ascii="Arial" w:cs="Arial" w:eastAsia="Arial" w:hAnsi="Arial"/>
-                <w:b/>
-                <w:bCs/>
-                <w:color w:val="FFFFFF"/>
-                <w:sz w:val="20"/>
-                <w:szCs w:val="20"/>
-              </w:rPr>
-              <w:t xml:space="preserve">評価</w:t>
-            </w:r>
-          </w:p>
-        </w:tc>
-        <w:tc>
-          <w:tcPr>
-            <w:tcW w:type="dxa" w:w="2426"/>
-            <w:tcBorders>
-              <w:top w:val="single" w:color="CCCCCC" w:sz="1"/>
-              <w:left w:val="single" w:color="CCCCCC" w:sz="1"/>
-              <w:bottom w:val="single" w:color="CCCCCC" w:sz="1"/>
-              <w:right w:val="single" w:color="CCCCCC" w:sz="1"/>
-            </w:tcBorders>
-            <w:shd w:fill="1E3060" w:val="clear"/>
-            <w:tcMar>
-              <w:top w:type="dxa" w:w="80"/>
-              <w:left w:type="dxa" w:w="120"/>
-              <w:bottom w:type="dxa" w:w="80"/>
-              <w:right w:type="dxa" w:w="120"/>
-            </w:tcMar>
-            <w:vAlign w:val="center"/>
-          </w:tcPr>
-          <w:p>
-            <w:pPr>
-              <w:jc w:val="center"/>
-            </w:pPr>
-            <w:r>
-              <w:rPr>
-                <w:rFonts w:ascii="Arial" w:cs="Arial" w:eastAsia="Arial" w:hAnsi="Arial"/>
-                <w:b/>
-                <w:bCs/>
-                <w:color w:val="FFFFFF"/>
-                <w:sz w:val="20"/>
-                <w:szCs w:val="20"/>
-              </w:rPr>
-              <w:t xml:space="preserve">意味</w:t>
-            </w:r>
-          </w:p>
-        </w:tc>
-      </w:tr>
-      <w:tr>
-        <w:tc>
-          <w:tcPr>
-            <w:tcW w:type="dxa" w:w="1800"/>
-            <w:tcBorders>
-              <w:top w:val="single" w:color="CCCCCC" w:sz="1"/>
-              <w:left w:val="single" w:color="CCCCCC" w:sz="1"/>
-              <w:bottom w:val="single" w:color="CCCCCC" w:sz="1"/>
-              <w:right w:val="single" w:color="CCCCCC" w:sz="1"/>
-            </w:tcBorders>
-            <w:tcMar>
-              <w:top w:type="dxa" w:w="80"/>
-              <w:left w:type="dxa" w:w="120"/>
-              <w:bottom w:type="dxa" w:w="80"/>
-              <w:right w:type="dxa" w:w="120"/>
-            </w:tcMar>
-          </w:tcPr>
-          <w:p>
-            <w:pPr>
-              <w:jc w:val="center"/>
-            </w:pPr>
-            <w:r>
-              <w:rPr>
-                <w:rFonts w:ascii="Arial" w:cs="Arial" w:eastAsia="Arial" w:hAnsi="Arial"/>
-                <w:sz w:val="20"/>
-                <w:szCs w:val="20"/>
-              </w:rPr>
-              <w:t xml:space="preserve">75〜100</w:t>
-            </w:r>
-          </w:p>
-        </w:tc>
-        <w:tc>
-          <w:tcPr>
-            <w:tcW w:type="dxa" w:w="2400"/>
-            <w:tcBorders>
-              <w:top w:val="single" w:color="CCCCCC" w:sz="1"/>
-              <w:left w:val="single" w:color="CCCCCC" w:sz="1"/>
-              <w:bottom w:val="single" w:color="CCCCCC" w:sz="1"/>
-              <w:right w:val="single" w:color="CCCCCC" w:sz="1"/>
-            </w:tcBorders>
-            <w:tcMar>
-              <w:top w:type="dxa" w:w="80"/>
-              <w:left w:type="dxa" w:w="120"/>
-              <w:bottom w:type="dxa" w:w="80"/>
-              <w:right w:type="dxa" w:w="120"/>
-            </w:tcMar>
-          </w:tcPr>
-          <w:p>
-            <w:pPr>
-              <w:jc w:val="left"/>
-            </w:pPr>
-            <w:r>
-              <w:rPr>
-                <w:rFonts w:ascii="Arial" w:cs="Arial" w:eastAsia="Arial" w:hAnsi="Arial"/>
-                <w:b/>
-                <w:bCs/>
-                <w:color w:val="1E3060"/>
-                <w:sz w:val="20"/>
-                <w:szCs w:val="20"/>
-              </w:rPr>
-              <w:t xml:space="preserve">サレジオネイビー</w:t>
-            </w:r>
-          </w:p>
-        </w:tc>
-        <w:tc>
-          <w:tcPr>
-            <w:tcW w:type="dxa" w:w="2400"/>
-            <w:tcBorders>
-              <w:top w:val="single" w:color="CCCCCC" w:sz="1"/>
-              <w:left w:val="single" w:color="CCCCCC" w:sz="1"/>
-              <w:bottom w:val="single" w:color="CCCCCC" w:sz="1"/>
-              <w:right w:val="single" w:color="CCCCCC" w:sz="1"/>
-            </w:tcBorders>
-            <w:tcMar>
-              <w:top w:type="dxa" w:w="80"/>
-              <w:left w:type="dxa" w:w="120"/>
-              <w:bottom w:type="dxa" w:w="80"/>
-              <w:right w:type="dxa" w:w="120"/>
-            </w:tcMar>
-          </w:tcPr>
-          <w:p>
-            <w:pPr>
-              <w:jc w:val="left"/>
-            </w:pPr>
-            <w:r>
-              <w:rPr>
-                <w:rFonts w:ascii="Arial" w:cs="Arial" w:eastAsia="Arial" w:hAnsi="Arial"/>
-                <w:sz w:val="20"/>
-                <w:szCs w:val="20"/>
-              </w:rPr>
-              <w:t xml:space="preserve">快適</w:t>
-            </w:r>
-          </w:p>
-        </w:tc>
-        <w:tc>
-          <w:tcPr>
-            <w:tcW w:type="dxa" w:w="2426"/>
-            <w:tcBorders>
-              <w:top w:val="single" w:color="CCCCCC" w:sz="1"/>
-              <w:left w:val="single" w:color="CCCCCC" w:sz="1"/>
-              <w:bottom w:val="single" w:color="CCCCCC" w:sz="1"/>
-              <w:right w:val="single" w:color="CCCCCC" w:sz="1"/>
-            </w:tcBorders>
-            <w:tcMar>
-              <w:top w:type="dxa" w:w="80"/>
-              <w:left w:type="dxa" w:w="120"/>
-              <w:bottom w:type="dxa" w:w="80"/>
-              <w:right w:type="dxa" w:w="120"/>
-            </w:tcMar>
-          </w:tcPr>
-          <w:p>
-            <w:pPr>
-              <w:jc w:val="left"/>
-            </w:pPr>
-            <w:r>
-              <w:rPr>
-                <w:rFonts w:ascii="Arial" w:cs="Arial" w:eastAsia="Arial" w:hAnsi="Arial"/>
-                <w:sz w:val="20"/>
-                <w:szCs w:val="20"/>
-              </w:rPr>
-              <w:t xml:space="preserve">理想的な環境</w:t>
-            </w:r>
-          </w:p>
-        </w:tc>
-      </w:tr>
-      <w:tr>
-        <w:tc>
-          <w:tcPr>
-            <w:tcW w:type="dxa" w:w="1800"/>
-            <w:tcBorders>
-              <w:top w:val="single" w:color="CCCCCC" w:sz="1"/>
-              <w:left w:val="single" w:color="CCCCCC" w:sz="1"/>
-              <w:bottom w:val="single" w:color="CCCCCC" w:sz="1"/>
-              <w:right w:val="single" w:color="CCCCCC" w:sz="1"/>
-            </w:tcBorders>
-            <w:tcMar>
-              <w:top w:type="dxa" w:w="80"/>
-              <w:left w:type="dxa" w:w="120"/>
-              <w:bottom w:type="dxa" w:w="80"/>
-              <w:right w:type="dxa" w:w="120"/>
-            </w:tcMar>
-          </w:tcPr>
-          <w:p>
-            <w:pPr>
-              <w:jc w:val="center"/>
-            </w:pPr>
-            <w:r>
-              <w:rPr>
-                <w:rFonts w:ascii="Arial" w:cs="Arial" w:eastAsia="Arial" w:hAnsi="Arial"/>
-                <w:sz w:val="20"/>
-                <w:szCs w:val="20"/>
-              </w:rPr>
-              <w:t xml:space="preserve">55〜74</w:t>
-            </w:r>
-          </w:p>
-        </w:tc>
-        <w:tc>
-          <w:tcPr>
-            <w:tcW w:type="dxa" w:w="2400"/>
-            <w:tcBorders>
-              <w:top w:val="single" w:color="CCCCCC" w:sz="1"/>
-              <w:left w:val="single" w:color="CCCCCC" w:sz="1"/>
-              <w:bottom w:val="single" w:color="CCCCCC" w:sz="1"/>
-              <w:right w:val="single" w:color="CCCCCC" w:sz="1"/>
-            </w:tcBorders>
-            <w:tcMar>
-              <w:top w:type="dxa" w:w="80"/>
-              <w:left w:type="dxa" w:w="120"/>
-              <w:bottom w:type="dxa" w:w="80"/>
-              <w:right w:type="dxa" w:w="120"/>
-            </w:tcMar>
-          </w:tcPr>
-          <w:p>
-            <w:pPr>
-              <w:jc w:val="left"/>
-            </w:pPr>
-            <w:r>
-              <w:rPr>
-                <w:rFonts w:ascii="Arial" w:cs="Arial" w:eastAsia="Arial" w:hAnsi="Arial"/>
-                <w:b/>
-                <w:bCs/>
-                <w:color w:val="2F6EB5"/>
-                <w:sz w:val="20"/>
-                <w:szCs w:val="20"/>
-              </w:rPr>
-              <w:t xml:space="preserve">ミッドブルー</w:t>
-            </w:r>
-          </w:p>
-        </w:tc>
-        <w:tc>
-          <w:tcPr>
-            <w:tcW w:type="dxa" w:w="2400"/>
-            <w:tcBorders>
-              <w:top w:val="single" w:color="CCCCCC" w:sz="1"/>
-              <w:left w:val="single" w:color="CCCCCC" w:sz="1"/>
-              <w:bottom w:val="single" w:color="CCCCCC" w:sz="1"/>
-              <w:right w:val="single" w:color="CCCCCC" w:sz="1"/>
-            </w:tcBorders>
-            <w:tcMar>
-              <w:top w:type="dxa" w:w="80"/>
-              <w:left w:type="dxa" w:w="120"/>
-              <w:bottom w:type="dxa" w:w="80"/>
-              <w:right w:type="dxa" w:w="120"/>
-            </w:tcMar>
-          </w:tcPr>
-          <w:p>
-            <w:pPr>
-              <w:jc w:val="left"/>
-            </w:pPr>
-            <w:r>
-              <w:rPr>
-                <w:rFonts w:ascii="Arial" w:cs="Arial" w:eastAsia="Arial" w:hAnsi="Arial"/>
-                <w:sz w:val="20"/>
-                <w:szCs w:val="20"/>
-              </w:rPr>
-              <w:t xml:space="preserve">良好</w:t>
-            </w:r>
-          </w:p>
-        </w:tc>
-        <w:tc>
-          <w:tcPr>
-            <w:tcW w:type="dxa" w:w="2426"/>
-            <w:tcBorders>
-              <w:top w:val="single" w:color="CCCCCC" w:sz="1"/>
-              <w:left w:val="single" w:color="CCCCCC" w:sz="1"/>
-              <w:bottom w:val="single" w:color="CCCCCC" w:sz="1"/>
-              <w:right w:val="single" w:color="CCCCCC" w:sz="1"/>
-            </w:tcBorders>
-            <w:tcMar>
-              <w:top w:type="dxa" w:w="80"/>
-              <w:left w:type="dxa" w:w="120"/>
-              <w:bottom w:type="dxa" w:w="80"/>
-              <w:right w:type="dxa" w:w="120"/>
-            </w:tcMar>
-          </w:tcPr>
-          <w:p>
-            <w:pPr>
-              <w:jc w:val="left"/>
-            </w:pPr>
-            <w:r>
-              <w:rPr>
-                <w:rFonts w:ascii="Arial" w:cs="Arial" w:eastAsia="Arial" w:hAnsi="Arial"/>
-                <w:sz w:val="20"/>
-                <w:szCs w:val="20"/>
-              </w:rPr>
-              <w:t xml:space="preserve">概ね快適</w:t>
-            </w:r>
-          </w:p>
-        </w:tc>
-      </w:tr>
-      <w:tr>
-        <w:tc>
-          <w:tcPr>
-            <w:tcW w:type="dxa" w:w="1800"/>
-            <w:tcBorders>
-              <w:top w:val="single" w:color="CCCCCC" w:sz="1"/>
-              <w:left w:val="single" w:color="CCCCCC" w:sz="1"/>
-              <w:bottom w:val="single" w:color="CCCCCC" w:sz="1"/>
-              <w:right w:val="single" w:color="CCCCCC" w:sz="1"/>
-            </w:tcBorders>
-            <w:tcMar>
-              <w:top w:type="dxa" w:w="80"/>
-              <w:left w:type="dxa" w:w="120"/>
-              <w:bottom w:type="dxa" w:w="80"/>
-              <w:right w:type="dxa" w:w="120"/>
-            </w:tcMar>
-          </w:tcPr>
-          <w:p>
-            <w:pPr>
-              <w:jc w:val="center"/>
-            </w:pPr>
-            <w:r>
-              <w:rPr>
-                <w:rFonts w:ascii="Arial" w:cs="Arial" w:eastAsia="Arial" w:hAnsi="Arial"/>
-                <w:sz w:val="20"/>
-                <w:szCs w:val="20"/>
-              </w:rPr>
-              <w:t xml:space="preserve">35〜54</w:t>
-            </w:r>
-          </w:p>
-        </w:tc>
-        <w:tc>
-          <w:tcPr>
-            <w:tcW w:type="dxa" w:w="2400"/>
-            <w:tcBorders>
-              <w:top w:val="single" w:color="CCCCCC" w:sz="1"/>
-              <w:left w:val="single" w:color="CCCCCC" w:sz="1"/>
-              <w:bottom w:val="single" w:color="CCCCCC" w:sz="1"/>
-              <w:right w:val="single" w:color="CCCCCC" w:sz="1"/>
-            </w:tcBorders>
-            <w:tcMar>
-              <w:top w:type="dxa" w:w="80"/>
-              <w:left w:type="dxa" w:w="120"/>
-              <w:bottom w:type="dxa" w:w="80"/>
-              <w:right w:type="dxa" w:w="120"/>
-            </w:tcMar>
-          </w:tcPr>
-          <w:p>
-            <w:pPr>
-              <w:jc w:val="left"/>
-            </w:pPr>
-            <w:r>
-              <w:rPr>
-                <w:rFonts w:ascii="Arial" w:cs="Arial" w:eastAsia="Arial" w:hAnsi="Arial"/>
-                <w:b/>
-                <w:bCs/>
-                <w:color w:val="5B9BD5"/>
-                <w:sz w:val="20"/>
-                <w:szCs w:val="20"/>
-              </w:rPr>
-              <w:t xml:space="preserve">アイスブルー</w:t>
-            </w:r>
-          </w:p>
-        </w:tc>
-        <w:tc>
-          <w:tcPr>
-            <w:tcW w:type="dxa" w:w="2400"/>
-            <w:tcBorders>
-              <w:top w:val="single" w:color="CCCCCC" w:sz="1"/>
-              <w:left w:val="single" w:color="CCCCCC" w:sz="1"/>
-              <w:bottom w:val="single" w:color="CCCCCC" w:sz="1"/>
-              <w:right w:val="single" w:color="CCCCCC" w:sz="1"/>
-            </w:tcBorders>
-            <w:tcMar>
-              <w:top w:type="dxa" w:w="80"/>
-              <w:left w:type="dxa" w:w="120"/>
-              <w:bottom w:type="dxa" w:w="80"/>
-              <w:right w:type="dxa" w:w="120"/>
-            </w:tcMar>
-          </w:tcPr>
-          <w:p>
-            <w:pPr>
-              <w:jc w:val="left"/>
-            </w:pPr>
-            <w:r>
-              <w:rPr>
-                <w:rFonts w:ascii="Arial" w:cs="Arial" w:eastAsia="Arial" w:hAnsi="Arial"/>
-                <w:sz w:val="20"/>
-                <w:szCs w:val="20"/>
-              </w:rPr>
-              <w:t xml:space="preserve">普通</w:t>
-            </w:r>
-          </w:p>
-        </w:tc>
-        <w:tc>
-          <w:tcPr>
-            <w:tcW w:type="dxa" w:w="2426"/>
-            <w:tcBorders>
-              <w:top w:val="single" w:color="CCCCCC" w:sz="1"/>
-              <w:left w:val="single" w:color="CCCCCC" w:sz="1"/>
-              <w:bottom w:val="single" w:color="CCCCCC" w:sz="1"/>
-              <w:right w:val="single" w:color="CCCCCC" w:sz="1"/>
-            </w:tcBorders>
-            <w:tcMar>
-              <w:top w:type="dxa" w:w="80"/>
-              <w:left w:type="dxa" w:w="120"/>
-              <w:bottom w:type="dxa" w:w="80"/>
-              <w:right w:type="dxa" w:w="120"/>
-            </w:tcMar>
-          </w:tcPr>
-          <w:p>
-            <w:pPr>
-              <w:jc w:val="left"/>
-            </w:pPr>
-            <w:r>
-              <w:rPr>
-                <w:rFonts w:ascii="Arial" w:cs="Arial" w:eastAsia="Arial" w:hAnsi="Arial"/>
-                <w:sz w:val="20"/>
-                <w:szCs w:val="20"/>
-              </w:rPr>
-              <w:t xml:space="preserve">快適範囲から少し外れ</w:t>
-            </w:r>
-          </w:p>
-        </w:tc>
-      </w:tr>
-      <w:tr>
-        <w:tc>
-          <w:tcPr>
-            <w:tcW w:type="dxa" w:w="1800"/>
-            <w:tcBorders>
-              <w:top w:val="single" w:color="CCCCCC" w:sz="1"/>
-              <w:left w:val="single" w:color="CCCCCC" w:sz="1"/>
-              <w:bottom w:val="single" w:color="CCCCCC" w:sz="1"/>
-              <w:right w:val="single" w:color="CCCCCC" w:sz="1"/>
-            </w:tcBorders>
-            <w:tcMar>
-              <w:top w:type="dxa" w:w="80"/>
-              <w:left w:type="dxa" w:w="120"/>
-              <w:bottom w:type="dxa" w:w="80"/>
-              <w:right w:type="dxa" w:w="120"/>
-            </w:tcMar>
-          </w:tcPr>
-          <w:p>
-            <w:pPr>
-              <w:jc w:val="center"/>
-            </w:pPr>
-            <w:r>
-              <w:rPr>
-                <w:rFonts w:ascii="Arial" w:cs="Arial" w:eastAsia="Arial" w:hAnsi="Arial"/>
-                <w:sz w:val="20"/>
-                <w:szCs w:val="20"/>
-              </w:rPr>
-              <w:t xml:space="preserve">0〜34</w:t>
-            </w:r>
-          </w:p>
-        </w:tc>
-        <w:tc>
-          <w:tcPr>
-            <w:tcW w:type="dxa" w:w="2400"/>
-            <w:tcBorders>
-              <w:top w:val="single" w:color="CCCCCC" w:sz="1"/>
-              <w:left w:val="single" w:color="CCCCCC" w:sz="1"/>
-              <w:bottom w:val="single" w:color="CCCCCC" w:sz="1"/>
-              <w:right w:val="single" w:color="CCCCCC" w:sz="1"/>
-            </w:tcBorders>
-            <w:tcMar>
-              <w:top w:type="dxa" w:w="80"/>
-              <w:left w:type="dxa" w:w="120"/>
-              <w:bottom w:type="dxa" w:w="80"/>
-              <w:right w:type="dxa" w:w="120"/>
-            </w:tcMar>
-          </w:tcPr>
-          <w:p>
-            <w:pPr>
-              <w:jc w:val="left"/>
-            </w:pPr>
-            <w:r>
-              <w:rPr>
-                <w:rFonts w:ascii="Arial" w:cs="Arial" w:eastAsia="Arial" w:hAnsi="Arial"/>
-                <w:b/>
-                <w:bCs/>
-                <w:color w:val="e55a4e"/>
-                <w:sz w:val="20"/>
-                <w:szCs w:val="20"/>
-              </w:rPr>
-              <w:t xml:space="preserve">レッド</w:t>
-            </w:r>
-          </w:p>
-        </w:tc>
-        <w:tc>
-          <w:tcPr>
-            <w:tcW w:type="dxa" w:w="2400"/>
-            <w:tcBorders>
-              <w:top w:val="single" w:color="CCCCCC" w:sz="1"/>
-              <w:left w:val="single" w:color="CCCCCC" w:sz="1"/>
-              <w:bottom w:val="single" w:color="CCCCCC" w:sz="1"/>
-              <w:right w:val="single" w:color="CCCCCC" w:sz="1"/>
-            </w:tcBorders>
-            <w:tcMar>
-              <w:top w:type="dxa" w:w="80"/>
-              <w:left w:type="dxa" w:w="120"/>
-              <w:bottom w:type="dxa" w:w="80"/>
-              <w:right w:type="dxa" w:w="120"/>
-            </w:tcMar>
-          </w:tcPr>
-          <w:p>
-            <w:pPr>
-              <w:jc w:val="left"/>
-            </w:pPr>
-            <w:r>
-              <w:rPr>
-                <w:rFonts w:ascii="Arial" w:cs="Arial" w:eastAsia="Arial" w:hAnsi="Arial"/>
-                <w:sz w:val="20"/>
-                <w:szCs w:val="20"/>
-              </w:rPr>
-              <w:t xml:space="preserve">不快</w:t>
-            </w:r>
-          </w:p>
-        </w:tc>
-        <w:tc>
-          <w:tcPr>
-            <w:tcW w:type="dxa" w:w="2426"/>
-            <w:tcBorders>
-              <w:top w:val="single" w:color="CCCCCC" w:sz="1"/>
-              <w:left w:val="single" w:color="CCCCCC" w:sz="1"/>
-              <w:bottom w:val="single" w:color="CCCCCC" w:sz="1"/>
-              <w:right w:val="single" w:color="CCCCCC" w:sz="1"/>
-            </w:tcBorders>
-            <w:tcMar>
-              <w:top w:type="dxa" w:w="80"/>
-              <w:left w:type="dxa" w:w="120"/>
-              <w:bottom w:type="dxa" w:w="80"/>
-              <w:right w:type="dxa" w:w="120"/>
-            </w:tcMar>
-          </w:tcPr>
-          <w:p>
-            <w:pPr>
-              <w:jc w:val="left"/>
-            </w:pPr>
-            <w:r>
-              <w:rPr>
-                <w:rFonts w:ascii="Arial" w:cs="Arial" w:eastAsia="Arial" w:hAnsi="Arial"/>
-                <w:sz w:val="20"/>
-                <w:szCs w:val="20"/>
-              </w:rPr>
-              <w:t xml:space="preserve">大きく外れた環境</w:t>
-            </w:r>
-          </w:p>
-        </w:tc>
-      </w:tr>
-    </w:tbl>
+        <w:t xml:space="preserve">ズーム: </w:t>
+      </w:r>
+      <w:r>
+        <w:rPr>
+          <w:rFonts w:ascii="Arial" w:cs="Arial" w:eastAsia="Arial" w:hAnsi="Arial"/>
+          <w:sz w:val="22"/>
+          <w:szCs w:val="22"/>
+        </w:rPr>
+        <w:t xml:space="preserve">マウスホイール または 画面左上の +/- ボタン</w:t>
+      </w:r>
+    </w:p>
+    <w:p>
+      <w:pPr>
+        <w:pStyle w:val="ListParagraph"/>
+        <w:numPr>
+          <w:ilvl w:val="0"/>
+          <w:numId w:val="3"/>
+        </w:numPr>
+        <w:spacing w:after="60"/>
+      </w:pPr>
+      <w:r>
+        <w:rPr>
+          <w:rFonts w:ascii="Arial" w:cs="Arial" w:eastAsia="Arial" w:hAnsi="Arial"/>
+          <w:b/>
+          <w:bCs/>
+          <w:sz w:val="22"/>
+          <w:szCs w:val="22"/>
+        </w:rPr>
+        <w:t xml:space="preserve">移動: </w:t>
+      </w:r>
+      <w:r>
+        <w:rPr>
+          <w:rFonts w:ascii="Arial" w:cs="Arial" w:eastAsia="Arial" w:hAnsi="Arial"/>
+          <w:sz w:val="22"/>
+          <w:szCs w:val="22"/>
+        </w:rPr>
+        <w:t xml:space="preserve">マウスでドラッグ</w:t>
+      </w:r>
+    </w:p>
+    <w:p>
+      <w:pPr>
+        <w:pStyle w:val="ListParagraph"/>
+        <w:numPr>
+          <w:ilvl w:val="0"/>
+          <w:numId w:val="3"/>
+        </w:numPr>
+        <w:spacing w:after="120"/>
+      </w:pPr>
+      <w:r>
+        <w:rPr>
+          <w:rFonts w:ascii="Arial" w:cs="Arial" w:eastAsia="Arial" w:hAnsi="Arial"/>
+          <w:b/>
+          <w:bCs/>
+          <w:sz w:val="22"/>
+          <w:szCs w:val="22"/>
+        </w:rPr>
+        <w:t xml:space="preserve">学校の詳細: </w:t>
+      </w:r>
+      <w:r>
+        <w:rPr>
+          <w:rFonts w:ascii="Arial" w:cs="Arial" w:eastAsia="Arial" w:hAnsi="Arial"/>
+          <w:sz w:val="22"/>
+          <w:szCs w:val="22"/>
+        </w:rPr>
+        <w:t xml:space="preserve">マーカーをクリックするとポップアップが開きます</w:t>
+      </w:r>
+    </w:p>
     <w:p>
       <w:pPr>
         <w:spacing w:after="200" w:before="120"/>
@@ -2315,9 +1633,9 @@
       <w:r>
         <w:drawing>
           <wp:inline distT="0" distB="0" distL="0" distR="0">
-            <wp:extent cx="2381250" cy="1695450"/>
+            <wp:extent cx="5524500" cy="3552825"/>
             <wp:effectExtent t="0" r="0" b="0" l="0"/>
-            <wp:docPr id="1" name="08_legend.png" descr="08_legend.png" title="08_legend.png"/>
+            <wp:docPr id="1" name="03_popup.png" descr="03_popup.png" title="03_popup.png"/>
             <wp:cNvGraphicFramePr>
               <a:graphicFrameLocks xmlns:a="http://schemas.openxmlformats.org/drawingml/2006/main" noChangeAspect="1"/>
             </wp:cNvGraphicFramePr>
@@ -2340,7 +1658,7 @@
                   <pic:spPr bwMode="auto">
                     <a:xfrm>
                       <a:off x="0" y="0"/>
-                      <a:ext cx="2381250" cy="1695450"/>
+                      <a:ext cx="5524500" cy="3552825"/>
                     </a:xfrm>
                     <a:prstGeom prst="rect">
                       <a:avLst/>
@@ -2367,20 +1685,15 @@
           <w:sz w:val="18"/>
           <w:szCs w:val="18"/>
         </w:rPr>
-        <w:t xml:space="preserve">図8: マップ凡例</w:t>
-      </w:r>
-    </w:p>
-    <w:p>
-      <w:r>
-        <w:br w:type="page"/>
-      </w:r>
-    </w:p>
-    <w:p>
-      <w:pPr>
-        <w:pStyle w:val="Heading1"/>
-      </w:pPr>
-      <w:r>
-        <w:t xml:space="preserve">6. 快適基準の調整</w:t>
+        <w:t xml:space="preserve">図8: 学校ポップアップ（センサー詳細情報）</w:t>
+      </w:r>
+    </w:p>
+    <w:p>
+      <w:pPr>
+        <w:pStyle w:val="Heading2"/>
+      </w:pPr>
+      <w:r>
+        <w:t xml:space="preserve">マーカーの色とスコア</w:t>
       </w:r>
     </w:p>
     <w:p>
@@ -2393,15 +1706,7 @@
           <w:sz w:val="22"/>
           <w:szCs w:val="22"/>
         </w:rPr>
-        <w:t xml:space="preserve">サイドバーの「快適設定」タブでは、各国の快適範囲をスライダーで調整できます。スライダーを動かすと、リアルタイムで全学校のスコアが再計算されます。</w:t>
-      </w:r>
-    </w:p>
-    <w:p>
-      <w:pPr>
-        <w:pStyle w:val="Heading2"/>
-      </w:pPr>
-      <w:r>
-        <w:t xml:space="preserve">デフォルト値</w:t>
+        <w:t xml:space="preserve">マーカーの色は快適スコアに連動しています。</w:t>
       </w:r>
     </w:p>
     <w:tbl>
@@ -2417,14 +1722,15 @@
         </w:tblBorders>
       </w:tblPr>
       <w:tblGrid>
-        <w:gridCol w:w="2200"/>
-        <w:gridCol w:w="3413"/>
-        <w:gridCol w:w="3413"/>
+        <w:gridCol w:w="1800"/>
+        <w:gridCol w:w="2400"/>
+        <w:gridCol w:w="2400"/>
+        <w:gridCol w:w="2426"/>
       </w:tblGrid>
       <w:tr>
         <w:tc>
           <w:tcPr>
-            <w:tcW w:type="dxa" w:w="2200"/>
+            <w:tcW w:type="dxa" w:w="1800"/>
             <w:tcBorders>
               <w:top w:val="single" w:color="CCCCCC" w:sz="1"/>
               <w:left w:val="single" w:color="CCCCCC" w:sz="1"/>
@@ -2453,13 +1759,13 @@
                 <w:sz w:val="20"/>
                 <w:szCs w:val="20"/>
               </w:rPr>
-              <w:t xml:space="preserve">センサー</w:t>
-            </w:r>
-          </w:p>
-        </w:tc>
-        <w:tc>
-          <w:tcPr>
-            <w:tcW w:type="dxa" w:w="3413"/>
+              <w:t xml:space="preserve">スコア</w:t>
+            </w:r>
+          </w:p>
+        </w:tc>
+        <w:tc>
+          <w:tcPr>
+            <w:tcW w:type="dxa" w:w="2400"/>
             <w:tcBorders>
               <w:top w:val="single" w:color="CCCCCC" w:sz="1"/>
               <w:left w:val="single" w:color="CCCCCC" w:sz="1"/>
@@ -2488,13 +1794,13 @@
                 <w:sz w:val="20"/>
                 <w:szCs w:val="20"/>
               </w:rPr>
-              <w:t xml:space="preserve">🇯🇵 日本の快適範囲</w:t>
-            </w:r>
-          </w:p>
-        </w:tc>
-        <w:tc>
-          <w:tcPr>
-            <w:tcW w:type="dxa" w:w="3413"/>
+              <w:t xml:space="preserve">色</w:t>
+            </w:r>
+          </w:p>
+        </w:tc>
+        <w:tc>
+          <w:tcPr>
+            <w:tcW w:type="dxa" w:w="2400"/>
             <w:tcBorders>
               <w:top w:val="single" w:color="CCCCCC" w:sz="1"/>
               <w:left w:val="single" w:color="CCCCCC" w:sz="1"/>
@@ -2523,7 +1829,42 @@
                 <w:sz w:val="20"/>
                 <w:szCs w:val="20"/>
               </w:rPr>
-              <w:t xml:space="preserve">🇮🇩 インドネシアの快適範囲</w:t>
+              <w:t xml:space="preserve">評価</w:t>
+            </w:r>
+          </w:p>
+        </w:tc>
+        <w:tc>
+          <w:tcPr>
+            <w:tcW w:type="dxa" w:w="2426"/>
+            <w:tcBorders>
+              <w:top w:val="single" w:color="CCCCCC" w:sz="1"/>
+              <w:left w:val="single" w:color="CCCCCC" w:sz="1"/>
+              <w:bottom w:val="single" w:color="CCCCCC" w:sz="1"/>
+              <w:right w:val="single" w:color="CCCCCC" w:sz="1"/>
+            </w:tcBorders>
+            <w:shd w:fill="1E3060" w:val="clear"/>
+            <w:tcMar>
+              <w:top w:type="dxa" w:w="80"/>
+              <w:left w:type="dxa" w:w="120"/>
+              <w:bottom w:type="dxa" w:w="80"/>
+              <w:right w:type="dxa" w:w="120"/>
+            </w:tcMar>
+            <w:vAlign w:val="center"/>
+          </w:tcPr>
+          <w:p>
+            <w:pPr>
+              <w:jc w:val="center"/>
+            </w:pPr>
+            <w:r>
+              <w:rPr>
+                <w:rFonts w:ascii="Arial" w:cs="Arial" w:eastAsia="Arial" w:hAnsi="Arial"/>
+                <w:b/>
+                <w:bCs/>
+                <w:color w:val="FFFFFF"/>
+                <w:sz w:val="20"/>
+                <w:szCs w:val="20"/>
+              </w:rPr>
+              <w:t xml:space="preserve">意味</w:t>
             </w:r>
           </w:p>
         </w:tc>
@@ -2531,7 +1872,37 @@
       <w:tr>
         <w:tc>
           <w:tcPr>
-            <w:tcW w:type="dxa" w:w="2200"/>
+            <w:tcW w:type="dxa" w:w="1800"/>
+            <w:tcBorders>
+              <w:top w:val="single" w:color="CCCCCC" w:sz="1"/>
+              <w:left w:val="single" w:color="CCCCCC" w:sz="1"/>
+              <w:bottom w:val="single" w:color="CCCCCC" w:sz="1"/>
+              <w:right w:val="single" w:color="CCCCCC" w:sz="1"/>
+            </w:tcBorders>
+            <w:tcMar>
+              <w:top w:type="dxa" w:w="80"/>
+              <w:left w:type="dxa" w:w="120"/>
+              <w:bottom w:type="dxa" w:w="80"/>
+              <w:right w:type="dxa" w:w="120"/>
+            </w:tcMar>
+          </w:tcPr>
+          <w:p>
+            <w:pPr>
+              <w:jc w:val="center"/>
+            </w:pPr>
+            <w:r>
+              <w:rPr>
+                <w:rFonts w:ascii="Arial" w:cs="Arial" w:eastAsia="Arial" w:hAnsi="Arial"/>
+                <w:sz w:val="20"/>
+                <w:szCs w:val="20"/>
+              </w:rPr>
+              <w:t xml:space="preserve">75〜100</w:t>
+            </w:r>
+          </w:p>
+        </w:tc>
+        <w:tc>
+          <w:tcPr>
+            <w:tcW w:type="dxa" w:w="2400"/>
             <w:tcBorders>
               <w:top w:val="single" w:color="CCCCCC" w:sz="1"/>
               <w:left w:val="single" w:color="CCCCCC" w:sz="1"/>
@@ -2554,70 +1925,71 @@
                 <w:rFonts w:ascii="Arial" w:cs="Arial" w:eastAsia="Arial" w:hAnsi="Arial"/>
                 <w:b/>
                 <w:bCs/>
-                <w:sz w:val="20"/>
-                <w:szCs w:val="20"/>
-              </w:rPr>
-              <w:t xml:space="preserve">🌡 温度</w:t>
-            </w:r>
-          </w:p>
-        </w:tc>
-        <w:tc>
-          <w:tcPr>
-            <w:tcW w:type="dxa" w:w="3413"/>
-            <w:tcBorders>
-              <w:top w:val="single" w:color="CCCCCC" w:sz="1"/>
-              <w:left w:val="single" w:color="CCCCCC" w:sz="1"/>
-              <w:bottom w:val="single" w:color="CCCCCC" w:sz="1"/>
-              <w:right w:val="single" w:color="CCCCCC" w:sz="1"/>
-            </w:tcBorders>
-            <w:tcMar>
-              <w:top w:type="dxa" w:w="80"/>
-              <w:left w:type="dxa" w:w="120"/>
-              <w:bottom w:type="dxa" w:w="80"/>
-              <w:right w:type="dxa" w:w="120"/>
-            </w:tcMar>
-          </w:tcPr>
-          <w:p>
-            <w:pPr>
-              <w:jc w:val="center"/>
-            </w:pPr>
-            <w:r>
-              <w:rPr>
-                <w:rFonts w:ascii="Arial" w:cs="Arial" w:eastAsia="Arial" w:hAnsi="Arial"/>
-                <w:sz w:val="20"/>
-                <w:szCs w:val="20"/>
-              </w:rPr>
-              <w:t xml:space="preserve">20〜26 ℃</w:t>
-            </w:r>
-          </w:p>
-        </w:tc>
-        <w:tc>
-          <w:tcPr>
-            <w:tcW w:type="dxa" w:w="3413"/>
-            <w:tcBorders>
-              <w:top w:val="single" w:color="CCCCCC" w:sz="1"/>
-              <w:left w:val="single" w:color="CCCCCC" w:sz="1"/>
-              <w:bottom w:val="single" w:color="CCCCCC" w:sz="1"/>
-              <w:right w:val="single" w:color="CCCCCC" w:sz="1"/>
-            </w:tcBorders>
-            <w:tcMar>
-              <w:top w:type="dxa" w:w="80"/>
-              <w:left w:type="dxa" w:w="120"/>
-              <w:bottom w:type="dxa" w:w="80"/>
-              <w:right w:type="dxa" w:w="120"/>
-            </w:tcMar>
-          </w:tcPr>
-          <w:p>
-            <w:pPr>
-              <w:jc w:val="center"/>
-            </w:pPr>
-            <w:r>
-              <w:rPr>
-                <w:rFonts w:ascii="Arial" w:cs="Arial" w:eastAsia="Arial" w:hAnsi="Arial"/>
-                <w:sz w:val="20"/>
-                <w:szCs w:val="20"/>
-              </w:rPr>
-              <w:t xml:space="preserve">26〜33 ℃</w:t>
+                <w:color w:val="1E3060"/>
+                <w:sz w:val="20"/>
+                <w:szCs w:val="20"/>
+              </w:rPr>
+              <w:t xml:space="preserve">サレジオネイビー</w:t>
+            </w:r>
+          </w:p>
+        </w:tc>
+        <w:tc>
+          <w:tcPr>
+            <w:tcW w:type="dxa" w:w="2400"/>
+            <w:tcBorders>
+              <w:top w:val="single" w:color="CCCCCC" w:sz="1"/>
+              <w:left w:val="single" w:color="CCCCCC" w:sz="1"/>
+              <w:bottom w:val="single" w:color="CCCCCC" w:sz="1"/>
+              <w:right w:val="single" w:color="CCCCCC" w:sz="1"/>
+            </w:tcBorders>
+            <w:tcMar>
+              <w:top w:type="dxa" w:w="80"/>
+              <w:left w:type="dxa" w:w="120"/>
+              <w:bottom w:type="dxa" w:w="80"/>
+              <w:right w:type="dxa" w:w="120"/>
+            </w:tcMar>
+          </w:tcPr>
+          <w:p>
+            <w:pPr>
+              <w:jc w:val="left"/>
+            </w:pPr>
+            <w:r>
+              <w:rPr>
+                <w:rFonts w:ascii="Arial" w:cs="Arial" w:eastAsia="Arial" w:hAnsi="Arial"/>
+                <w:sz w:val="20"/>
+                <w:szCs w:val="20"/>
+              </w:rPr>
+              <w:t xml:space="preserve">快適</w:t>
+            </w:r>
+          </w:p>
+        </w:tc>
+        <w:tc>
+          <w:tcPr>
+            <w:tcW w:type="dxa" w:w="2426"/>
+            <w:tcBorders>
+              <w:top w:val="single" w:color="CCCCCC" w:sz="1"/>
+              <w:left w:val="single" w:color="CCCCCC" w:sz="1"/>
+              <w:bottom w:val="single" w:color="CCCCCC" w:sz="1"/>
+              <w:right w:val="single" w:color="CCCCCC" w:sz="1"/>
+            </w:tcBorders>
+            <w:tcMar>
+              <w:top w:type="dxa" w:w="80"/>
+              <w:left w:type="dxa" w:w="120"/>
+              <w:bottom w:type="dxa" w:w="80"/>
+              <w:right w:type="dxa" w:w="120"/>
+            </w:tcMar>
+          </w:tcPr>
+          <w:p>
+            <w:pPr>
+              <w:jc w:val="left"/>
+            </w:pPr>
+            <w:r>
+              <w:rPr>
+                <w:rFonts w:ascii="Arial" w:cs="Arial" w:eastAsia="Arial" w:hAnsi="Arial"/>
+                <w:sz w:val="20"/>
+                <w:szCs w:val="20"/>
+              </w:rPr>
+              <w:t xml:space="preserve">理想的な環境</w:t>
             </w:r>
           </w:p>
         </w:tc>
@@ -2625,7 +1997,37 @@
       <w:tr>
         <w:tc>
           <w:tcPr>
-            <w:tcW w:type="dxa" w:w="2200"/>
+            <w:tcW w:type="dxa" w:w="1800"/>
+            <w:tcBorders>
+              <w:top w:val="single" w:color="CCCCCC" w:sz="1"/>
+              <w:left w:val="single" w:color="CCCCCC" w:sz="1"/>
+              <w:bottom w:val="single" w:color="CCCCCC" w:sz="1"/>
+              <w:right w:val="single" w:color="CCCCCC" w:sz="1"/>
+            </w:tcBorders>
+            <w:tcMar>
+              <w:top w:type="dxa" w:w="80"/>
+              <w:left w:type="dxa" w:w="120"/>
+              <w:bottom w:type="dxa" w:w="80"/>
+              <w:right w:type="dxa" w:w="120"/>
+            </w:tcMar>
+          </w:tcPr>
+          <w:p>
+            <w:pPr>
+              <w:jc w:val="center"/>
+            </w:pPr>
+            <w:r>
+              <w:rPr>
+                <w:rFonts w:ascii="Arial" w:cs="Arial" w:eastAsia="Arial" w:hAnsi="Arial"/>
+                <w:sz w:val="20"/>
+                <w:szCs w:val="20"/>
+              </w:rPr>
+              <w:t xml:space="preserve">55〜74</w:t>
+            </w:r>
+          </w:p>
+        </w:tc>
+        <w:tc>
+          <w:tcPr>
+            <w:tcW w:type="dxa" w:w="2400"/>
             <w:tcBorders>
               <w:top w:val="single" w:color="CCCCCC" w:sz="1"/>
               <w:left w:val="single" w:color="CCCCCC" w:sz="1"/>
@@ -2648,70 +2050,71 @@
                 <w:rFonts w:ascii="Arial" w:cs="Arial" w:eastAsia="Arial" w:hAnsi="Arial"/>
                 <w:b/>
                 <w:bCs/>
-                <w:sz w:val="20"/>
-                <w:szCs w:val="20"/>
-              </w:rPr>
-              <w:t xml:space="preserve">💧 湿度</w:t>
-            </w:r>
-          </w:p>
-        </w:tc>
-        <w:tc>
-          <w:tcPr>
-            <w:tcW w:type="dxa" w:w="3413"/>
-            <w:tcBorders>
-              <w:top w:val="single" w:color="CCCCCC" w:sz="1"/>
-              <w:left w:val="single" w:color="CCCCCC" w:sz="1"/>
-              <w:bottom w:val="single" w:color="CCCCCC" w:sz="1"/>
-              <w:right w:val="single" w:color="CCCCCC" w:sz="1"/>
-            </w:tcBorders>
-            <w:tcMar>
-              <w:top w:type="dxa" w:w="80"/>
-              <w:left w:type="dxa" w:w="120"/>
-              <w:bottom w:type="dxa" w:w="80"/>
-              <w:right w:type="dxa" w:w="120"/>
-            </w:tcMar>
-          </w:tcPr>
-          <w:p>
-            <w:pPr>
-              <w:jc w:val="center"/>
-            </w:pPr>
-            <w:r>
-              <w:rPr>
-                <w:rFonts w:ascii="Arial" w:cs="Arial" w:eastAsia="Arial" w:hAnsi="Arial"/>
-                <w:sz w:val="20"/>
-                <w:szCs w:val="20"/>
-              </w:rPr>
-              <w:t xml:space="preserve">40〜60 %</w:t>
-            </w:r>
-          </w:p>
-        </w:tc>
-        <w:tc>
-          <w:tcPr>
-            <w:tcW w:type="dxa" w:w="3413"/>
-            <w:tcBorders>
-              <w:top w:val="single" w:color="CCCCCC" w:sz="1"/>
-              <w:left w:val="single" w:color="CCCCCC" w:sz="1"/>
-              <w:bottom w:val="single" w:color="CCCCCC" w:sz="1"/>
-              <w:right w:val="single" w:color="CCCCCC" w:sz="1"/>
-            </w:tcBorders>
-            <w:tcMar>
-              <w:top w:type="dxa" w:w="80"/>
-              <w:left w:type="dxa" w:w="120"/>
-              <w:bottom w:type="dxa" w:w="80"/>
-              <w:right w:type="dxa" w:w="120"/>
-            </w:tcMar>
-          </w:tcPr>
-          <w:p>
-            <w:pPr>
-              <w:jc w:val="center"/>
-            </w:pPr>
-            <w:r>
-              <w:rPr>
-                <w:rFonts w:ascii="Arial" w:cs="Arial" w:eastAsia="Arial" w:hAnsi="Arial"/>
-                <w:sz w:val="20"/>
-                <w:szCs w:val="20"/>
-              </w:rPr>
-              <w:t xml:space="preserve">55〜82 %</w:t>
+                <w:color w:val="2F6EB5"/>
+                <w:sz w:val="20"/>
+                <w:szCs w:val="20"/>
+              </w:rPr>
+              <w:t xml:space="preserve">ミッドブルー</w:t>
+            </w:r>
+          </w:p>
+        </w:tc>
+        <w:tc>
+          <w:tcPr>
+            <w:tcW w:type="dxa" w:w="2400"/>
+            <w:tcBorders>
+              <w:top w:val="single" w:color="CCCCCC" w:sz="1"/>
+              <w:left w:val="single" w:color="CCCCCC" w:sz="1"/>
+              <w:bottom w:val="single" w:color="CCCCCC" w:sz="1"/>
+              <w:right w:val="single" w:color="CCCCCC" w:sz="1"/>
+            </w:tcBorders>
+            <w:tcMar>
+              <w:top w:type="dxa" w:w="80"/>
+              <w:left w:type="dxa" w:w="120"/>
+              <w:bottom w:type="dxa" w:w="80"/>
+              <w:right w:type="dxa" w:w="120"/>
+            </w:tcMar>
+          </w:tcPr>
+          <w:p>
+            <w:pPr>
+              <w:jc w:val="left"/>
+            </w:pPr>
+            <w:r>
+              <w:rPr>
+                <w:rFonts w:ascii="Arial" w:cs="Arial" w:eastAsia="Arial" w:hAnsi="Arial"/>
+                <w:sz w:val="20"/>
+                <w:szCs w:val="20"/>
+              </w:rPr>
+              <w:t xml:space="preserve">良好</w:t>
+            </w:r>
+          </w:p>
+        </w:tc>
+        <w:tc>
+          <w:tcPr>
+            <w:tcW w:type="dxa" w:w="2426"/>
+            <w:tcBorders>
+              <w:top w:val="single" w:color="CCCCCC" w:sz="1"/>
+              <w:left w:val="single" w:color="CCCCCC" w:sz="1"/>
+              <w:bottom w:val="single" w:color="CCCCCC" w:sz="1"/>
+              <w:right w:val="single" w:color="CCCCCC" w:sz="1"/>
+            </w:tcBorders>
+            <w:tcMar>
+              <w:top w:type="dxa" w:w="80"/>
+              <w:left w:type="dxa" w:w="120"/>
+              <w:bottom w:type="dxa" w:w="80"/>
+              <w:right w:type="dxa" w:w="120"/>
+            </w:tcMar>
+          </w:tcPr>
+          <w:p>
+            <w:pPr>
+              <w:jc w:val="left"/>
+            </w:pPr>
+            <w:r>
+              <w:rPr>
+                <w:rFonts w:ascii="Arial" w:cs="Arial" w:eastAsia="Arial" w:hAnsi="Arial"/>
+                <w:sz w:val="20"/>
+                <w:szCs w:val="20"/>
+              </w:rPr>
+              <w:t xml:space="preserve">概ね快適</w:t>
             </w:r>
           </w:p>
         </w:tc>
@@ -2719,7 +2122,37 @@
       <w:tr>
         <w:tc>
           <w:tcPr>
-            <w:tcW w:type="dxa" w:w="2200"/>
+            <w:tcW w:type="dxa" w:w="1800"/>
+            <w:tcBorders>
+              <w:top w:val="single" w:color="CCCCCC" w:sz="1"/>
+              <w:left w:val="single" w:color="CCCCCC" w:sz="1"/>
+              <w:bottom w:val="single" w:color="CCCCCC" w:sz="1"/>
+              <w:right w:val="single" w:color="CCCCCC" w:sz="1"/>
+            </w:tcBorders>
+            <w:tcMar>
+              <w:top w:type="dxa" w:w="80"/>
+              <w:left w:type="dxa" w:w="120"/>
+              <w:bottom w:type="dxa" w:w="80"/>
+              <w:right w:type="dxa" w:w="120"/>
+            </w:tcMar>
+          </w:tcPr>
+          <w:p>
+            <w:pPr>
+              <w:jc w:val="center"/>
+            </w:pPr>
+            <w:r>
+              <w:rPr>
+                <w:rFonts w:ascii="Arial" w:cs="Arial" w:eastAsia="Arial" w:hAnsi="Arial"/>
+                <w:sz w:val="20"/>
+                <w:szCs w:val="20"/>
+              </w:rPr>
+              <w:t xml:space="preserve">35〜54</w:t>
+            </w:r>
+          </w:p>
+        </w:tc>
+        <w:tc>
+          <w:tcPr>
+            <w:tcW w:type="dxa" w:w="2400"/>
             <w:tcBorders>
               <w:top w:val="single" w:color="CCCCCC" w:sz="1"/>
               <w:left w:val="single" w:color="CCCCCC" w:sz="1"/>
@@ -2742,70 +2175,71 @@
                 <w:rFonts w:ascii="Arial" w:cs="Arial" w:eastAsia="Arial" w:hAnsi="Arial"/>
                 <w:b/>
                 <w:bCs/>
-                <w:sz w:val="20"/>
-                <w:szCs w:val="20"/>
-              </w:rPr>
-              <w:t xml:space="preserve">💡 照度</w:t>
-            </w:r>
-          </w:p>
-        </w:tc>
-        <w:tc>
-          <w:tcPr>
-            <w:tcW w:type="dxa" w:w="3413"/>
-            <w:tcBorders>
-              <w:top w:val="single" w:color="CCCCCC" w:sz="1"/>
-              <w:left w:val="single" w:color="CCCCCC" w:sz="1"/>
-              <w:bottom w:val="single" w:color="CCCCCC" w:sz="1"/>
-              <w:right w:val="single" w:color="CCCCCC" w:sz="1"/>
-            </w:tcBorders>
-            <w:tcMar>
-              <w:top w:type="dxa" w:w="80"/>
-              <w:left w:type="dxa" w:w="120"/>
-              <w:bottom w:type="dxa" w:w="80"/>
-              <w:right w:type="dxa" w:w="120"/>
-            </w:tcMar>
-          </w:tcPr>
-          <w:p>
-            <w:pPr>
-              <w:jc w:val="center"/>
-            </w:pPr>
-            <w:r>
-              <w:rPr>
-                <w:rFonts w:ascii="Arial" w:cs="Arial" w:eastAsia="Arial" w:hAnsi="Arial"/>
-                <w:sz w:val="20"/>
-                <w:szCs w:val="20"/>
-              </w:rPr>
-              <w:t xml:space="preserve">300〜700 lx</w:t>
-            </w:r>
-          </w:p>
-        </w:tc>
-        <w:tc>
-          <w:tcPr>
-            <w:tcW w:type="dxa" w:w="3413"/>
-            <w:tcBorders>
-              <w:top w:val="single" w:color="CCCCCC" w:sz="1"/>
-              <w:left w:val="single" w:color="CCCCCC" w:sz="1"/>
-              <w:bottom w:val="single" w:color="CCCCCC" w:sz="1"/>
-              <w:right w:val="single" w:color="CCCCCC" w:sz="1"/>
-            </w:tcBorders>
-            <w:tcMar>
-              <w:top w:type="dxa" w:w="80"/>
-              <w:left w:type="dxa" w:w="120"/>
-              <w:bottom w:type="dxa" w:w="80"/>
-              <w:right w:type="dxa" w:w="120"/>
-            </w:tcMar>
-          </w:tcPr>
-          <w:p>
-            <w:pPr>
-              <w:jc w:val="center"/>
-            </w:pPr>
-            <w:r>
-              <w:rPr>
-                <w:rFonts w:ascii="Arial" w:cs="Arial" w:eastAsia="Arial" w:hAnsi="Arial"/>
-                <w:sz w:val="20"/>
-                <w:szCs w:val="20"/>
-              </w:rPr>
-              <w:t xml:space="preserve">400〜1000 lx</w:t>
+                <w:color w:val="5B9BD5"/>
+                <w:sz w:val="20"/>
+                <w:szCs w:val="20"/>
+              </w:rPr>
+              <w:t xml:space="preserve">アイスブルー</w:t>
+            </w:r>
+          </w:p>
+        </w:tc>
+        <w:tc>
+          <w:tcPr>
+            <w:tcW w:type="dxa" w:w="2400"/>
+            <w:tcBorders>
+              <w:top w:val="single" w:color="CCCCCC" w:sz="1"/>
+              <w:left w:val="single" w:color="CCCCCC" w:sz="1"/>
+              <w:bottom w:val="single" w:color="CCCCCC" w:sz="1"/>
+              <w:right w:val="single" w:color="CCCCCC" w:sz="1"/>
+            </w:tcBorders>
+            <w:tcMar>
+              <w:top w:type="dxa" w:w="80"/>
+              <w:left w:type="dxa" w:w="120"/>
+              <w:bottom w:type="dxa" w:w="80"/>
+              <w:right w:type="dxa" w:w="120"/>
+            </w:tcMar>
+          </w:tcPr>
+          <w:p>
+            <w:pPr>
+              <w:jc w:val="left"/>
+            </w:pPr>
+            <w:r>
+              <w:rPr>
+                <w:rFonts w:ascii="Arial" w:cs="Arial" w:eastAsia="Arial" w:hAnsi="Arial"/>
+                <w:sz w:val="20"/>
+                <w:szCs w:val="20"/>
+              </w:rPr>
+              <w:t xml:space="preserve">普通</w:t>
+            </w:r>
+          </w:p>
+        </w:tc>
+        <w:tc>
+          <w:tcPr>
+            <w:tcW w:type="dxa" w:w="2426"/>
+            <w:tcBorders>
+              <w:top w:val="single" w:color="CCCCCC" w:sz="1"/>
+              <w:left w:val="single" w:color="CCCCCC" w:sz="1"/>
+              <w:bottom w:val="single" w:color="CCCCCC" w:sz="1"/>
+              <w:right w:val="single" w:color="CCCCCC" w:sz="1"/>
+            </w:tcBorders>
+            <w:tcMar>
+              <w:top w:type="dxa" w:w="80"/>
+              <w:left w:type="dxa" w:w="120"/>
+              <w:bottom w:type="dxa" w:w="80"/>
+              <w:right w:type="dxa" w:w="120"/>
+            </w:tcMar>
+          </w:tcPr>
+          <w:p>
+            <w:pPr>
+              <w:jc w:val="left"/>
+            </w:pPr>
+            <w:r>
+              <w:rPr>
+                <w:rFonts w:ascii="Arial" w:cs="Arial" w:eastAsia="Arial" w:hAnsi="Arial"/>
+                <w:sz w:val="20"/>
+                <w:szCs w:val="20"/>
+              </w:rPr>
+              <w:t xml:space="preserve">快適範囲から少し外れ</w:t>
             </w:r>
           </w:p>
         </w:tc>
@@ -2813,7 +2247,37 @@
       <w:tr>
         <w:tc>
           <w:tcPr>
-            <w:tcW w:type="dxa" w:w="2200"/>
+            <w:tcW w:type="dxa" w:w="1800"/>
+            <w:tcBorders>
+              <w:top w:val="single" w:color="CCCCCC" w:sz="1"/>
+              <w:left w:val="single" w:color="CCCCCC" w:sz="1"/>
+              <w:bottom w:val="single" w:color="CCCCCC" w:sz="1"/>
+              <w:right w:val="single" w:color="CCCCCC" w:sz="1"/>
+            </w:tcBorders>
+            <w:tcMar>
+              <w:top w:type="dxa" w:w="80"/>
+              <w:left w:type="dxa" w:w="120"/>
+              <w:bottom w:type="dxa" w:w="80"/>
+              <w:right w:type="dxa" w:w="120"/>
+            </w:tcMar>
+          </w:tcPr>
+          <w:p>
+            <w:pPr>
+              <w:jc w:val="center"/>
+            </w:pPr>
+            <w:r>
+              <w:rPr>
+                <w:rFonts w:ascii="Arial" w:cs="Arial" w:eastAsia="Arial" w:hAnsi="Arial"/>
+                <w:sz w:val="20"/>
+                <w:szCs w:val="20"/>
+              </w:rPr>
+              <w:t xml:space="preserve">0〜34</w:t>
+            </w:r>
+          </w:p>
+        </w:tc>
+        <w:tc>
+          <w:tcPr>
+            <w:tcW w:type="dxa" w:w="2400"/>
             <w:tcBorders>
               <w:top w:val="single" w:color="CCCCCC" w:sz="1"/>
               <w:left w:val="single" w:color="CCCCCC" w:sz="1"/>
@@ -2836,70 +2300,71 @@
                 <w:rFonts w:ascii="Arial" w:cs="Arial" w:eastAsia="Arial" w:hAnsi="Arial"/>
                 <w:b/>
                 <w:bCs/>
-                <w:sz w:val="20"/>
-                <w:szCs w:val="20"/>
-              </w:rPr>
-              <w:t xml:space="preserve">🔊 騒音</w:t>
-            </w:r>
-          </w:p>
-        </w:tc>
-        <w:tc>
-          <w:tcPr>
-            <w:tcW w:type="dxa" w:w="3413"/>
-            <w:tcBorders>
-              <w:top w:val="single" w:color="CCCCCC" w:sz="1"/>
-              <w:left w:val="single" w:color="CCCCCC" w:sz="1"/>
-              <w:bottom w:val="single" w:color="CCCCCC" w:sz="1"/>
-              <w:right w:val="single" w:color="CCCCCC" w:sz="1"/>
-            </w:tcBorders>
-            <w:tcMar>
-              <w:top w:type="dxa" w:w="80"/>
-              <w:left w:type="dxa" w:w="120"/>
-              <w:bottom w:type="dxa" w:w="80"/>
-              <w:right w:type="dxa" w:w="120"/>
-            </w:tcMar>
-          </w:tcPr>
-          <w:p>
-            <w:pPr>
-              <w:jc w:val="center"/>
-            </w:pPr>
-            <w:r>
-              <w:rPr>
-                <w:rFonts w:ascii="Arial" w:cs="Arial" w:eastAsia="Arial" w:hAnsi="Arial"/>
-                <w:sz w:val="20"/>
-                <w:szCs w:val="20"/>
-              </w:rPr>
-              <w:t xml:space="preserve">35〜55 dB</w:t>
-            </w:r>
-          </w:p>
-        </w:tc>
-        <w:tc>
-          <w:tcPr>
-            <w:tcW w:type="dxa" w:w="3413"/>
-            <w:tcBorders>
-              <w:top w:val="single" w:color="CCCCCC" w:sz="1"/>
-              <w:left w:val="single" w:color="CCCCCC" w:sz="1"/>
-              <w:bottom w:val="single" w:color="CCCCCC" w:sz="1"/>
-              <w:right w:val="single" w:color="CCCCCC" w:sz="1"/>
-            </w:tcBorders>
-            <w:tcMar>
-              <w:top w:type="dxa" w:w="80"/>
-              <w:left w:type="dxa" w:w="120"/>
-              <w:bottom w:type="dxa" w:w="80"/>
-              <w:right w:type="dxa" w:w="120"/>
-            </w:tcMar>
-          </w:tcPr>
-          <w:p>
-            <w:pPr>
-              <w:jc w:val="center"/>
-            </w:pPr>
-            <w:r>
-              <w:rPr>
-                <w:rFonts w:ascii="Arial" w:cs="Arial" w:eastAsia="Arial" w:hAnsi="Arial"/>
-                <w:sz w:val="20"/>
-                <w:szCs w:val="20"/>
-              </w:rPr>
-              <w:t xml:space="preserve">42〜68 dB</w:t>
+                <w:color w:val="e55a4e"/>
+                <w:sz w:val="20"/>
+                <w:szCs w:val="20"/>
+              </w:rPr>
+              <w:t xml:space="preserve">レッド</w:t>
+            </w:r>
+          </w:p>
+        </w:tc>
+        <w:tc>
+          <w:tcPr>
+            <w:tcW w:type="dxa" w:w="2400"/>
+            <w:tcBorders>
+              <w:top w:val="single" w:color="CCCCCC" w:sz="1"/>
+              <w:left w:val="single" w:color="CCCCCC" w:sz="1"/>
+              <w:bottom w:val="single" w:color="CCCCCC" w:sz="1"/>
+              <w:right w:val="single" w:color="CCCCCC" w:sz="1"/>
+            </w:tcBorders>
+            <w:tcMar>
+              <w:top w:type="dxa" w:w="80"/>
+              <w:left w:type="dxa" w:w="120"/>
+              <w:bottom w:type="dxa" w:w="80"/>
+              <w:right w:type="dxa" w:w="120"/>
+            </w:tcMar>
+          </w:tcPr>
+          <w:p>
+            <w:pPr>
+              <w:jc w:val="left"/>
+            </w:pPr>
+            <w:r>
+              <w:rPr>
+                <w:rFonts w:ascii="Arial" w:cs="Arial" w:eastAsia="Arial" w:hAnsi="Arial"/>
+                <w:sz w:val="20"/>
+                <w:szCs w:val="20"/>
+              </w:rPr>
+              <w:t xml:space="preserve">不快</w:t>
+            </w:r>
+          </w:p>
+        </w:tc>
+        <w:tc>
+          <w:tcPr>
+            <w:tcW w:type="dxa" w:w="2426"/>
+            <w:tcBorders>
+              <w:top w:val="single" w:color="CCCCCC" w:sz="1"/>
+              <w:left w:val="single" w:color="CCCCCC" w:sz="1"/>
+              <w:bottom w:val="single" w:color="CCCCCC" w:sz="1"/>
+              <w:right w:val="single" w:color="CCCCCC" w:sz="1"/>
+            </w:tcBorders>
+            <w:tcMar>
+              <w:top w:type="dxa" w:w="80"/>
+              <w:left w:type="dxa" w:w="120"/>
+              <w:bottom w:type="dxa" w:w="80"/>
+              <w:right w:type="dxa" w:w="120"/>
+            </w:tcMar>
+          </w:tcPr>
+          <w:p>
+            <w:pPr>
+              <w:jc w:val="left"/>
+            </w:pPr>
+            <w:r>
+              <w:rPr>
+                <w:rFonts w:ascii="Arial" w:cs="Arial" w:eastAsia="Arial" w:hAnsi="Arial"/>
+                <w:sz w:val="20"/>
+                <w:szCs w:val="20"/>
+              </w:rPr>
+              <w:t xml:space="preserve">大きく外れた環境</w:t>
             </w:r>
           </w:p>
         </w:tc>
@@ -2913,9 +2378,9 @@
       <w:r>
         <w:drawing>
           <wp:inline distT="0" distB="0" distL="0" distR="0">
-            <wp:extent cx="5524500" cy="3552825"/>
+            <wp:extent cx="2381250" cy="1695450"/>
             <wp:effectExtent t="0" r="0" b="0" l="0"/>
-            <wp:docPr id="1" name="05_comfort_settings.png" descr="05_comfort_settings.png" title="05_comfort_settings.png"/>
+            <wp:docPr id="1" name="09_legend.png" descr="09_legend.png" title="09_legend.png"/>
             <wp:cNvGraphicFramePr>
               <a:graphicFrameLocks xmlns:a="http://schemas.openxmlformats.org/drawingml/2006/main" noChangeAspect="1"/>
             </wp:cNvGraphicFramePr>
@@ -2938,6 +2403,604 @@
                   <pic:spPr bwMode="auto">
                     <a:xfrm>
                       <a:off x="0" y="0"/>
+                      <a:ext cx="2381250" cy="1695450"/>
+                    </a:xfrm>
+                    <a:prstGeom prst="rect">
+                      <a:avLst/>
+                    </a:prstGeom>
+                  </pic:spPr>
+                </pic:pic>
+              </a:graphicData>
+            </a:graphic>
+          </wp:inline>
+        </w:drawing>
+      </w:r>
+    </w:p>
+    <w:p>
+      <w:pPr>
+        <w:spacing w:after="200"/>
+        <w:jc w:val="center"/>
+      </w:pPr>
+      <w:r>
+        <w:rPr>
+          <w:rFonts w:ascii="Arial" w:cs="Arial" w:eastAsia="Arial" w:hAnsi="Arial"/>
+          <w:i/>
+          <w:iCs/>
+          <w:color w:val="666666"/>
+          <w:sz w:val="18"/>
+          <w:szCs w:val="18"/>
+        </w:rPr>
+        <w:t xml:space="preserve">図9: マップ凡例</w:t>
+      </w:r>
+    </w:p>
+    <w:p>
+      <w:r>
+        <w:br w:type="page"/>
+      </w:r>
+    </w:p>
+    <w:p>
+      <w:pPr>
+        <w:pStyle w:val="Heading1"/>
+      </w:pPr>
+      <w:r>
+        <w:t xml:space="preserve">6. 快適基準の調整</w:t>
+      </w:r>
+    </w:p>
+    <w:p>
+      <w:pPr>
+        <w:spacing w:after="120"/>
+      </w:pPr>
+      <w:r>
+        <w:rPr>
+          <w:rFonts w:ascii="Arial" w:cs="Arial" w:eastAsia="Arial" w:hAnsi="Arial"/>
+          <w:sz w:val="22"/>
+          <w:szCs w:val="22"/>
+        </w:rPr>
+        <w:t xml:space="preserve">サイドバーの「快適設定」タブでは、各国の快適範囲をスライダーで調整できます。スライダーを動かすと、リアルタイムで全学校のスコアが再計算されます。</w:t>
+      </w:r>
+    </w:p>
+    <w:p>
+      <w:pPr>
+        <w:pStyle w:val="Heading2"/>
+      </w:pPr>
+      <w:r>
+        <w:t xml:space="preserve">デフォルト値</w:t>
+      </w:r>
+    </w:p>
+    <w:tbl>
+      <w:tblPr>
+        <w:tblW w:type="dxa" w:w="9026"/>
+        <w:tblBorders>
+          <w:top w:val="single" w:color="auto" w:sz="4"/>
+          <w:left w:val="single" w:color="auto" w:sz="4"/>
+          <w:bottom w:val="single" w:color="auto" w:sz="4"/>
+          <w:right w:val="single" w:color="auto" w:sz="4"/>
+          <w:insideH w:val="single" w:color="auto" w:sz="4"/>
+          <w:insideV w:val="single" w:color="auto" w:sz="4"/>
+        </w:tblBorders>
+      </w:tblPr>
+      <w:tblGrid>
+        <w:gridCol w:w="2200"/>
+        <w:gridCol w:w="3413"/>
+        <w:gridCol w:w="3413"/>
+      </w:tblGrid>
+      <w:tr>
+        <w:tc>
+          <w:tcPr>
+            <w:tcW w:type="dxa" w:w="2200"/>
+            <w:tcBorders>
+              <w:top w:val="single" w:color="CCCCCC" w:sz="1"/>
+              <w:left w:val="single" w:color="CCCCCC" w:sz="1"/>
+              <w:bottom w:val="single" w:color="CCCCCC" w:sz="1"/>
+              <w:right w:val="single" w:color="CCCCCC" w:sz="1"/>
+            </w:tcBorders>
+            <w:shd w:fill="1E3060" w:val="clear"/>
+            <w:tcMar>
+              <w:top w:type="dxa" w:w="80"/>
+              <w:left w:type="dxa" w:w="120"/>
+              <w:bottom w:type="dxa" w:w="80"/>
+              <w:right w:type="dxa" w:w="120"/>
+            </w:tcMar>
+            <w:vAlign w:val="center"/>
+          </w:tcPr>
+          <w:p>
+            <w:pPr>
+              <w:jc w:val="center"/>
+            </w:pPr>
+            <w:r>
+              <w:rPr>
+                <w:rFonts w:ascii="Arial" w:cs="Arial" w:eastAsia="Arial" w:hAnsi="Arial"/>
+                <w:b/>
+                <w:bCs/>
+                <w:color w:val="FFFFFF"/>
+                <w:sz w:val="20"/>
+                <w:szCs w:val="20"/>
+              </w:rPr>
+              <w:t xml:space="preserve">センサー</w:t>
+            </w:r>
+          </w:p>
+        </w:tc>
+        <w:tc>
+          <w:tcPr>
+            <w:tcW w:type="dxa" w:w="3413"/>
+            <w:tcBorders>
+              <w:top w:val="single" w:color="CCCCCC" w:sz="1"/>
+              <w:left w:val="single" w:color="CCCCCC" w:sz="1"/>
+              <w:bottom w:val="single" w:color="CCCCCC" w:sz="1"/>
+              <w:right w:val="single" w:color="CCCCCC" w:sz="1"/>
+            </w:tcBorders>
+            <w:shd w:fill="1E3060" w:val="clear"/>
+            <w:tcMar>
+              <w:top w:type="dxa" w:w="80"/>
+              <w:left w:type="dxa" w:w="120"/>
+              <w:bottom w:type="dxa" w:w="80"/>
+              <w:right w:type="dxa" w:w="120"/>
+            </w:tcMar>
+            <w:vAlign w:val="center"/>
+          </w:tcPr>
+          <w:p>
+            <w:pPr>
+              <w:jc w:val="center"/>
+            </w:pPr>
+            <w:r>
+              <w:rPr>
+                <w:rFonts w:ascii="Arial" w:cs="Arial" w:eastAsia="Arial" w:hAnsi="Arial"/>
+                <w:b/>
+                <w:bCs/>
+                <w:color w:val="FFFFFF"/>
+                <w:sz w:val="20"/>
+                <w:szCs w:val="20"/>
+              </w:rPr>
+              <w:t xml:space="preserve">🇯🇵 日本の快適範囲</w:t>
+            </w:r>
+          </w:p>
+        </w:tc>
+        <w:tc>
+          <w:tcPr>
+            <w:tcW w:type="dxa" w:w="3413"/>
+            <w:tcBorders>
+              <w:top w:val="single" w:color="CCCCCC" w:sz="1"/>
+              <w:left w:val="single" w:color="CCCCCC" w:sz="1"/>
+              <w:bottom w:val="single" w:color="CCCCCC" w:sz="1"/>
+              <w:right w:val="single" w:color="CCCCCC" w:sz="1"/>
+            </w:tcBorders>
+            <w:shd w:fill="1E3060" w:val="clear"/>
+            <w:tcMar>
+              <w:top w:type="dxa" w:w="80"/>
+              <w:left w:type="dxa" w:w="120"/>
+              <w:bottom w:type="dxa" w:w="80"/>
+              <w:right w:type="dxa" w:w="120"/>
+            </w:tcMar>
+            <w:vAlign w:val="center"/>
+          </w:tcPr>
+          <w:p>
+            <w:pPr>
+              <w:jc w:val="center"/>
+            </w:pPr>
+            <w:r>
+              <w:rPr>
+                <w:rFonts w:ascii="Arial" w:cs="Arial" w:eastAsia="Arial" w:hAnsi="Arial"/>
+                <w:b/>
+                <w:bCs/>
+                <w:color w:val="FFFFFF"/>
+                <w:sz w:val="20"/>
+                <w:szCs w:val="20"/>
+              </w:rPr>
+              <w:t xml:space="preserve">🇮🇩 インドネシアの快適範囲</w:t>
+            </w:r>
+          </w:p>
+        </w:tc>
+      </w:tr>
+      <w:tr>
+        <w:tc>
+          <w:tcPr>
+            <w:tcW w:type="dxa" w:w="2200"/>
+            <w:tcBorders>
+              <w:top w:val="single" w:color="CCCCCC" w:sz="1"/>
+              <w:left w:val="single" w:color="CCCCCC" w:sz="1"/>
+              <w:bottom w:val="single" w:color="CCCCCC" w:sz="1"/>
+              <w:right w:val="single" w:color="CCCCCC" w:sz="1"/>
+            </w:tcBorders>
+            <w:tcMar>
+              <w:top w:type="dxa" w:w="80"/>
+              <w:left w:type="dxa" w:w="120"/>
+              <w:bottom w:type="dxa" w:w="80"/>
+              <w:right w:type="dxa" w:w="120"/>
+            </w:tcMar>
+          </w:tcPr>
+          <w:p>
+            <w:pPr>
+              <w:jc w:val="left"/>
+            </w:pPr>
+            <w:r>
+              <w:rPr>
+                <w:rFonts w:ascii="Arial" w:cs="Arial" w:eastAsia="Arial" w:hAnsi="Arial"/>
+                <w:b/>
+                <w:bCs/>
+                <w:sz w:val="20"/>
+                <w:szCs w:val="20"/>
+              </w:rPr>
+              <w:t xml:space="preserve">🌡 温度</w:t>
+            </w:r>
+          </w:p>
+        </w:tc>
+        <w:tc>
+          <w:tcPr>
+            <w:tcW w:type="dxa" w:w="3413"/>
+            <w:tcBorders>
+              <w:top w:val="single" w:color="CCCCCC" w:sz="1"/>
+              <w:left w:val="single" w:color="CCCCCC" w:sz="1"/>
+              <w:bottom w:val="single" w:color="CCCCCC" w:sz="1"/>
+              <w:right w:val="single" w:color="CCCCCC" w:sz="1"/>
+            </w:tcBorders>
+            <w:tcMar>
+              <w:top w:type="dxa" w:w="80"/>
+              <w:left w:type="dxa" w:w="120"/>
+              <w:bottom w:type="dxa" w:w="80"/>
+              <w:right w:type="dxa" w:w="120"/>
+            </w:tcMar>
+          </w:tcPr>
+          <w:p>
+            <w:pPr>
+              <w:jc w:val="center"/>
+            </w:pPr>
+            <w:r>
+              <w:rPr>
+                <w:rFonts w:ascii="Arial" w:cs="Arial" w:eastAsia="Arial" w:hAnsi="Arial"/>
+                <w:sz w:val="20"/>
+                <w:szCs w:val="20"/>
+              </w:rPr>
+              <w:t xml:space="preserve">20〜26 ℃</w:t>
+            </w:r>
+          </w:p>
+        </w:tc>
+        <w:tc>
+          <w:tcPr>
+            <w:tcW w:type="dxa" w:w="3413"/>
+            <w:tcBorders>
+              <w:top w:val="single" w:color="CCCCCC" w:sz="1"/>
+              <w:left w:val="single" w:color="CCCCCC" w:sz="1"/>
+              <w:bottom w:val="single" w:color="CCCCCC" w:sz="1"/>
+              <w:right w:val="single" w:color="CCCCCC" w:sz="1"/>
+            </w:tcBorders>
+            <w:tcMar>
+              <w:top w:type="dxa" w:w="80"/>
+              <w:left w:type="dxa" w:w="120"/>
+              <w:bottom w:type="dxa" w:w="80"/>
+              <w:right w:type="dxa" w:w="120"/>
+            </w:tcMar>
+          </w:tcPr>
+          <w:p>
+            <w:pPr>
+              <w:jc w:val="center"/>
+            </w:pPr>
+            <w:r>
+              <w:rPr>
+                <w:rFonts w:ascii="Arial" w:cs="Arial" w:eastAsia="Arial" w:hAnsi="Arial"/>
+                <w:sz w:val="20"/>
+                <w:szCs w:val="20"/>
+              </w:rPr>
+              <w:t xml:space="preserve">26〜33 ℃</w:t>
+            </w:r>
+          </w:p>
+        </w:tc>
+      </w:tr>
+      <w:tr>
+        <w:tc>
+          <w:tcPr>
+            <w:tcW w:type="dxa" w:w="2200"/>
+            <w:tcBorders>
+              <w:top w:val="single" w:color="CCCCCC" w:sz="1"/>
+              <w:left w:val="single" w:color="CCCCCC" w:sz="1"/>
+              <w:bottom w:val="single" w:color="CCCCCC" w:sz="1"/>
+              <w:right w:val="single" w:color="CCCCCC" w:sz="1"/>
+            </w:tcBorders>
+            <w:tcMar>
+              <w:top w:type="dxa" w:w="80"/>
+              <w:left w:type="dxa" w:w="120"/>
+              <w:bottom w:type="dxa" w:w="80"/>
+              <w:right w:type="dxa" w:w="120"/>
+            </w:tcMar>
+          </w:tcPr>
+          <w:p>
+            <w:pPr>
+              <w:jc w:val="left"/>
+            </w:pPr>
+            <w:r>
+              <w:rPr>
+                <w:rFonts w:ascii="Arial" w:cs="Arial" w:eastAsia="Arial" w:hAnsi="Arial"/>
+                <w:b/>
+                <w:bCs/>
+                <w:sz w:val="20"/>
+                <w:szCs w:val="20"/>
+              </w:rPr>
+              <w:t xml:space="preserve">💧 湿度</w:t>
+            </w:r>
+          </w:p>
+        </w:tc>
+        <w:tc>
+          <w:tcPr>
+            <w:tcW w:type="dxa" w:w="3413"/>
+            <w:tcBorders>
+              <w:top w:val="single" w:color="CCCCCC" w:sz="1"/>
+              <w:left w:val="single" w:color="CCCCCC" w:sz="1"/>
+              <w:bottom w:val="single" w:color="CCCCCC" w:sz="1"/>
+              <w:right w:val="single" w:color="CCCCCC" w:sz="1"/>
+            </w:tcBorders>
+            <w:tcMar>
+              <w:top w:type="dxa" w:w="80"/>
+              <w:left w:type="dxa" w:w="120"/>
+              <w:bottom w:type="dxa" w:w="80"/>
+              <w:right w:type="dxa" w:w="120"/>
+            </w:tcMar>
+          </w:tcPr>
+          <w:p>
+            <w:pPr>
+              <w:jc w:val="center"/>
+            </w:pPr>
+            <w:r>
+              <w:rPr>
+                <w:rFonts w:ascii="Arial" w:cs="Arial" w:eastAsia="Arial" w:hAnsi="Arial"/>
+                <w:sz w:val="20"/>
+                <w:szCs w:val="20"/>
+              </w:rPr>
+              <w:t xml:space="preserve">40〜60 %</w:t>
+            </w:r>
+          </w:p>
+        </w:tc>
+        <w:tc>
+          <w:tcPr>
+            <w:tcW w:type="dxa" w:w="3413"/>
+            <w:tcBorders>
+              <w:top w:val="single" w:color="CCCCCC" w:sz="1"/>
+              <w:left w:val="single" w:color="CCCCCC" w:sz="1"/>
+              <w:bottom w:val="single" w:color="CCCCCC" w:sz="1"/>
+              <w:right w:val="single" w:color="CCCCCC" w:sz="1"/>
+            </w:tcBorders>
+            <w:tcMar>
+              <w:top w:type="dxa" w:w="80"/>
+              <w:left w:type="dxa" w:w="120"/>
+              <w:bottom w:type="dxa" w:w="80"/>
+              <w:right w:type="dxa" w:w="120"/>
+            </w:tcMar>
+          </w:tcPr>
+          <w:p>
+            <w:pPr>
+              <w:jc w:val="center"/>
+            </w:pPr>
+            <w:r>
+              <w:rPr>
+                <w:rFonts w:ascii="Arial" w:cs="Arial" w:eastAsia="Arial" w:hAnsi="Arial"/>
+                <w:sz w:val="20"/>
+                <w:szCs w:val="20"/>
+              </w:rPr>
+              <w:t xml:space="preserve">55〜82 %</w:t>
+            </w:r>
+          </w:p>
+        </w:tc>
+      </w:tr>
+      <w:tr>
+        <w:tc>
+          <w:tcPr>
+            <w:tcW w:type="dxa" w:w="2200"/>
+            <w:tcBorders>
+              <w:top w:val="single" w:color="CCCCCC" w:sz="1"/>
+              <w:left w:val="single" w:color="CCCCCC" w:sz="1"/>
+              <w:bottom w:val="single" w:color="CCCCCC" w:sz="1"/>
+              <w:right w:val="single" w:color="CCCCCC" w:sz="1"/>
+            </w:tcBorders>
+            <w:tcMar>
+              <w:top w:type="dxa" w:w="80"/>
+              <w:left w:type="dxa" w:w="120"/>
+              <w:bottom w:type="dxa" w:w="80"/>
+              <w:right w:type="dxa" w:w="120"/>
+            </w:tcMar>
+          </w:tcPr>
+          <w:p>
+            <w:pPr>
+              <w:jc w:val="left"/>
+            </w:pPr>
+            <w:r>
+              <w:rPr>
+                <w:rFonts w:ascii="Arial" w:cs="Arial" w:eastAsia="Arial" w:hAnsi="Arial"/>
+                <w:b/>
+                <w:bCs/>
+                <w:sz w:val="20"/>
+                <w:szCs w:val="20"/>
+              </w:rPr>
+              <w:t xml:space="preserve">💡 照度</w:t>
+            </w:r>
+          </w:p>
+        </w:tc>
+        <w:tc>
+          <w:tcPr>
+            <w:tcW w:type="dxa" w:w="3413"/>
+            <w:tcBorders>
+              <w:top w:val="single" w:color="CCCCCC" w:sz="1"/>
+              <w:left w:val="single" w:color="CCCCCC" w:sz="1"/>
+              <w:bottom w:val="single" w:color="CCCCCC" w:sz="1"/>
+              <w:right w:val="single" w:color="CCCCCC" w:sz="1"/>
+            </w:tcBorders>
+            <w:tcMar>
+              <w:top w:type="dxa" w:w="80"/>
+              <w:left w:type="dxa" w:w="120"/>
+              <w:bottom w:type="dxa" w:w="80"/>
+              <w:right w:type="dxa" w:w="120"/>
+            </w:tcMar>
+          </w:tcPr>
+          <w:p>
+            <w:pPr>
+              <w:jc w:val="center"/>
+            </w:pPr>
+            <w:r>
+              <w:rPr>
+                <w:rFonts w:ascii="Arial" w:cs="Arial" w:eastAsia="Arial" w:hAnsi="Arial"/>
+                <w:sz w:val="20"/>
+                <w:szCs w:val="20"/>
+              </w:rPr>
+              <w:t xml:space="preserve">300〜700 lx</w:t>
+            </w:r>
+          </w:p>
+        </w:tc>
+        <w:tc>
+          <w:tcPr>
+            <w:tcW w:type="dxa" w:w="3413"/>
+            <w:tcBorders>
+              <w:top w:val="single" w:color="CCCCCC" w:sz="1"/>
+              <w:left w:val="single" w:color="CCCCCC" w:sz="1"/>
+              <w:bottom w:val="single" w:color="CCCCCC" w:sz="1"/>
+              <w:right w:val="single" w:color="CCCCCC" w:sz="1"/>
+            </w:tcBorders>
+            <w:tcMar>
+              <w:top w:type="dxa" w:w="80"/>
+              <w:left w:type="dxa" w:w="120"/>
+              <w:bottom w:type="dxa" w:w="80"/>
+              <w:right w:type="dxa" w:w="120"/>
+            </w:tcMar>
+          </w:tcPr>
+          <w:p>
+            <w:pPr>
+              <w:jc w:val="center"/>
+            </w:pPr>
+            <w:r>
+              <w:rPr>
+                <w:rFonts w:ascii="Arial" w:cs="Arial" w:eastAsia="Arial" w:hAnsi="Arial"/>
+                <w:sz w:val="20"/>
+                <w:szCs w:val="20"/>
+              </w:rPr>
+              <w:t xml:space="preserve">400〜1000 lx</w:t>
+            </w:r>
+          </w:p>
+        </w:tc>
+      </w:tr>
+      <w:tr>
+        <w:tc>
+          <w:tcPr>
+            <w:tcW w:type="dxa" w:w="2200"/>
+            <w:tcBorders>
+              <w:top w:val="single" w:color="CCCCCC" w:sz="1"/>
+              <w:left w:val="single" w:color="CCCCCC" w:sz="1"/>
+              <w:bottom w:val="single" w:color="CCCCCC" w:sz="1"/>
+              <w:right w:val="single" w:color="CCCCCC" w:sz="1"/>
+            </w:tcBorders>
+            <w:tcMar>
+              <w:top w:type="dxa" w:w="80"/>
+              <w:left w:type="dxa" w:w="120"/>
+              <w:bottom w:type="dxa" w:w="80"/>
+              <w:right w:type="dxa" w:w="120"/>
+            </w:tcMar>
+          </w:tcPr>
+          <w:p>
+            <w:pPr>
+              <w:jc w:val="left"/>
+            </w:pPr>
+            <w:r>
+              <w:rPr>
+                <w:rFonts w:ascii="Arial" w:cs="Arial" w:eastAsia="Arial" w:hAnsi="Arial"/>
+                <w:b/>
+                <w:bCs/>
+                <w:sz w:val="20"/>
+                <w:szCs w:val="20"/>
+              </w:rPr>
+              <w:t xml:space="preserve">🔊 騒音</w:t>
+            </w:r>
+          </w:p>
+        </w:tc>
+        <w:tc>
+          <w:tcPr>
+            <w:tcW w:type="dxa" w:w="3413"/>
+            <w:tcBorders>
+              <w:top w:val="single" w:color="CCCCCC" w:sz="1"/>
+              <w:left w:val="single" w:color="CCCCCC" w:sz="1"/>
+              <w:bottom w:val="single" w:color="CCCCCC" w:sz="1"/>
+              <w:right w:val="single" w:color="CCCCCC" w:sz="1"/>
+            </w:tcBorders>
+            <w:tcMar>
+              <w:top w:type="dxa" w:w="80"/>
+              <w:left w:type="dxa" w:w="120"/>
+              <w:bottom w:type="dxa" w:w="80"/>
+              <w:right w:type="dxa" w:w="120"/>
+            </w:tcMar>
+          </w:tcPr>
+          <w:p>
+            <w:pPr>
+              <w:jc w:val="center"/>
+            </w:pPr>
+            <w:r>
+              <w:rPr>
+                <w:rFonts w:ascii="Arial" w:cs="Arial" w:eastAsia="Arial" w:hAnsi="Arial"/>
+                <w:sz w:val="20"/>
+                <w:szCs w:val="20"/>
+              </w:rPr>
+              <w:t xml:space="preserve">35〜55 dB</w:t>
+            </w:r>
+          </w:p>
+        </w:tc>
+        <w:tc>
+          <w:tcPr>
+            <w:tcW w:type="dxa" w:w="3413"/>
+            <w:tcBorders>
+              <w:top w:val="single" w:color="CCCCCC" w:sz="1"/>
+              <w:left w:val="single" w:color="CCCCCC" w:sz="1"/>
+              <w:bottom w:val="single" w:color="CCCCCC" w:sz="1"/>
+              <w:right w:val="single" w:color="CCCCCC" w:sz="1"/>
+            </w:tcBorders>
+            <w:tcMar>
+              <w:top w:type="dxa" w:w="80"/>
+              <w:left w:type="dxa" w:w="120"/>
+              <w:bottom w:type="dxa" w:w="80"/>
+              <w:right w:type="dxa" w:w="120"/>
+            </w:tcMar>
+          </w:tcPr>
+          <w:p>
+            <w:pPr>
+              <w:jc w:val="center"/>
+            </w:pPr>
+            <w:r>
+              <w:rPr>
+                <w:rFonts w:ascii="Arial" w:cs="Arial" w:eastAsia="Arial" w:hAnsi="Arial"/>
+                <w:sz w:val="20"/>
+                <w:szCs w:val="20"/>
+              </w:rPr>
+              <w:t xml:space="preserve">42〜68 dB</w:t>
+            </w:r>
+          </w:p>
+        </w:tc>
+      </w:tr>
+    </w:tbl>
+    <w:p>
+      <w:pPr>
+        <w:spacing w:after="200" w:before="120"/>
+        <w:jc w:val="center"/>
+      </w:pPr>
+      <w:r>
+        <w:drawing>
+          <wp:inline distT="0" distB="0" distL="0" distR="0">
+            <wp:extent cx="5524500" cy="3552825"/>
+            <wp:effectExtent t="0" r="0" b="0" l="0"/>
+            <wp:docPr id="1" name="06_comfort_settings.png" descr="06_comfort_settings.png" title="06_comfort_settings.png"/>
+            <wp:cNvGraphicFramePr>
+              <a:graphicFrameLocks xmlns:a="http://schemas.openxmlformats.org/drawingml/2006/main" noChangeAspect="1"/>
+            </wp:cNvGraphicFramePr>
+            <a:graphic xmlns:a="http://schemas.openxmlformats.org/drawingml/2006/main">
+              <a:graphicData uri="http://schemas.openxmlformats.org/drawingml/2006/picture">
+                <pic:pic xmlns:pic="http://schemas.openxmlformats.org/drawingml/2006/picture">
+                  <pic:nvPicPr>
+                    <pic:cNvPr id="0" name="" descr=""/>
+                    <pic:cNvPicPr>
+                      <a:picLocks noChangeAspect="1" noChangeArrowheads="1"/>
+                    </pic:cNvPicPr>
+                  </pic:nvPicPr>
+                  <pic:blipFill>
+                    <a:blip r:embed="rId18" cstate="none"/>
+                    <a:srcRect/>
+                    <a:stretch>
+                      <a:fillRect/>
+                    </a:stretch>
+                  </pic:blipFill>
+                  <pic:spPr bwMode="auto">
+                    <a:xfrm>
+                      <a:off x="0" y="0"/>
                       <a:ext cx="5524500" cy="3552825"/>
                     </a:xfrm>
                     <a:prstGeom prst="rect">
@@ -2965,7 +3028,7 @@
           <w:sz w:val="18"/>
           <w:szCs w:val="18"/>
         </w:rPr>
-        <w:t xml:space="preserve">図9: 快適基準設定タブ</w:t>
+        <w:t xml:space="preserve">図10: 快適基準設定タブ</w:t>
       </w:r>
     </w:p>
     <w:p>
@@ -3843,7 +3906,7 @@
           <wp:inline distT="0" distB="0" distL="0" distR="0">
             <wp:extent cx="5334000" cy="314325"/>
             <wp:effectExtent t="0" r="0" b="0" l="0"/>
-            <wp:docPr id="1" name="09_compare_bar.png" descr="09_compare_bar.png" title="09_compare_bar.png"/>
+            <wp:docPr id="1" name="10_compare_bar.png" descr="10_compare_bar.png" title="10_compare_bar.png"/>
             <wp:cNvGraphicFramePr>
               <a:graphicFrameLocks xmlns:a="http://schemas.openxmlformats.org/drawingml/2006/main" noChangeAspect="1"/>
             </wp:cNvGraphicFramePr>
@@ -3893,7 +3956,7 @@
           <w:sz w:val="18"/>
           <w:szCs w:val="18"/>
         </w:rPr>
-        <w:t xml:space="preserve">図10: 比較パネル</w:t>
+        <w:t xml:space="preserve">図11: 比較パネル</w:t>
       </w:r>
     </w:p>
     <w:p>
@@ -4061,7 +4124,7 @@
           <wp:inline distT="0" distB="0" distL="0" distR="0">
             <wp:extent cx="5524500" cy="3552825"/>
             <wp:effectExtent t="0" r="0" b="0" l="0"/>
-            <wp:docPr id="1" name="06_serial_tab.png" descr="06_serial_tab.png" title="06_serial_tab.png"/>
+            <wp:docPr id="1" name="07_serial_tab.png" descr="07_serial_tab.png" title="07_serial_tab.png"/>
             <wp:cNvGraphicFramePr>
               <a:graphicFrameLocks xmlns:a="http://schemas.openxmlformats.org/drawingml/2006/main" noChangeAspect="1"/>
             </wp:cNvGraphicFramePr>
@@ -4075,7 +4138,7 @@
                     </pic:cNvPicPr>
                   </pic:nvPicPr>
                   <pic:blipFill>
-                    <a:blip r:embed="rId18" cstate="none"/>
+                    <a:blip r:embed="rId19" cstate="none"/>
                     <a:srcRect/>
                     <a:stretch>
                       <a:fillRect/>
@@ -4111,7 +4174,7 @@
           <w:sz w:val="18"/>
           <w:szCs w:val="18"/>
         </w:rPr>
-        <w:t xml:space="preserve">図11: センサー接続タブ</w:t>
+        <w:t xml:space="preserve">図12: センサー接続タブ</w:t>
       </w:r>
     </w:p>
     <w:p>

</xml_diff>